<commit_message>
Desarrollado las operaciones del backend.
Desarrollo de la API REST para el sistema de reservaciones de restaurante (Spring Boot + PostgreSQL).

Cambios y avances incluidos:
- Implementación completa de controladores y servicios para las entidades Mesa y Reserva.
- Aplicación de reglas de negocio y restricciones de unicidad (evitación de duplicados en número de mesa y de reservaciones).
- Inclusión de scripts de base de datos con al menos 10 registros de prueba para Mesas y 5 para Reservas.
- Documentación de pruebas y evidencias con capturas de pantalla de Postman (respuestas HTTP exitosas y manejo de errores 500 por restricciones).
- Actualización de la documentación de evidencia del proyecto final.
</commit_message>
<xml_diff>
--- a/Proyecto Final - Backend - Reservas de Mesas para Restaurante/restaurante/evidencias/evidencias.docx
+++ b/Proyecto Final - Backend - Reservas de Mesas para Restaurante/restaurante/evidencias/evidencias.docx
@@ -108,7 +108,7 @@
                     </pic:cNvPicPr>
                   </pic:nvPicPr>
                   <pic:blipFill>
-                    <a:blip r:embed="rId5">
+                    <a:blip r:embed="rId6">
                       <a:lum bright="70000" contrast="-70000"/>
                       <a:extLst>
                         <a:ext uri="{28A0092B-C50C-407E-A947-70E740481C1C}">
@@ -431,7 +431,6 @@
     </w:p>
     <w:p>
       <w:pPr>
-        <w:jc w:val="center"/>
         <w:rPr>
           <w:rFonts w:ascii="Times New Roman" w:hAnsi="Times New Roman" w:cs="Times New Roman"/>
           <w:b/>
@@ -457,6 +456,7 @@
     </w:p>
     <w:p>
       <w:pPr>
+        <w:spacing w:after="0"/>
         <w:jc w:val="center"/>
         <w:rPr>
           <w:rFonts w:ascii="Times New Roman" w:hAnsi="Times New Roman" w:cs="Times New Roman"/>
@@ -467,11 +467,7 @@
           <w:lang w:val="es-ES"/>
         </w:rPr>
       </w:pPr>
-    </w:p>
-    <w:p>
-      <w:pPr>
-        <w:spacing w:after="0"/>
-        <w:jc w:val="center"/>
+      <w:r>
         <w:rPr>
           <w:rFonts w:ascii="Times New Roman" w:hAnsi="Times New Roman" w:cs="Times New Roman"/>
           <w:b/>
@@ -480,6 +476,19 @@
           <w:szCs w:val="28"/>
           <w:lang w:val="es-ES"/>
         </w:rPr>
+        <w:t>Estudiante: Kevin Oswaldo Rivera Sánchez</w:t>
+      </w:r>
+    </w:p>
+    <w:p>
+      <w:pPr>
+        <w:spacing w:after="0"/>
+        <w:jc w:val="center"/>
+        <w:rPr>
+          <w:rFonts w:ascii="Times New Roman" w:hAnsi="Times New Roman" w:cs="Times New Roman"/>
+          <w:sz w:val="28"/>
+          <w:szCs w:val="28"/>
+          <w:lang w:val="es-ES"/>
+        </w:rPr>
       </w:pPr>
       <w:r>
         <w:rPr>
@@ -490,88 +499,76 @@
           <w:szCs w:val="28"/>
           <w:lang w:val="es-ES"/>
         </w:rPr>
-        <w:t>Estudiante: Kevin Oswaldo Rivera Sánchez</w:t>
-      </w:r>
-    </w:p>
-    <w:p>
-      <w:pPr>
-        <w:spacing w:after="0"/>
-        <w:jc w:val="center"/>
+        <w:t xml:space="preserve">Carné: </w:t>
+      </w:r>
+      <w:r>
         <w:rPr>
           <w:rFonts w:ascii="Times New Roman" w:hAnsi="Times New Roman" w:cs="Times New Roman"/>
           <w:sz w:val="28"/>
           <w:szCs w:val="28"/>
           <w:lang w:val="es-ES"/>
         </w:rPr>
-      </w:pPr>
-      <w:r>
-        <w:rPr>
-          <w:rFonts w:ascii="Times New Roman" w:hAnsi="Times New Roman" w:cs="Times New Roman"/>
-          <w:b/>
-          <w:bCs/>
-          <w:sz w:val="28"/>
-          <w:szCs w:val="28"/>
-          <w:lang w:val="es-ES"/>
-        </w:rPr>
-        <w:t xml:space="preserve">Carné: </w:t>
-      </w:r>
-      <w:r>
+        <w:t>9941-25-612</w:t>
+      </w:r>
+    </w:p>
+    <w:p>
+      <w:pPr>
+        <w:tabs>
+          <w:tab w:val="center" w:pos="4419"/>
+          <w:tab w:val="left" w:pos="7080"/>
+        </w:tabs>
         <w:rPr>
           <w:rFonts w:ascii="Times New Roman" w:hAnsi="Times New Roman" w:cs="Times New Roman"/>
           <w:sz w:val="28"/>
           <w:szCs w:val="28"/>
           <w:lang w:val="es-ES"/>
         </w:rPr>
-        <w:t>9941-25-612</w:t>
-      </w:r>
-    </w:p>
-    <w:p>
-      <w:pPr>
-        <w:tabs>
-          <w:tab w:val="center" w:pos="4419"/>
-          <w:tab w:val="left" w:pos="7080"/>
-        </w:tabs>
+      </w:pPr>
+      <w:r>
         <w:rPr>
           <w:rFonts w:ascii="Times New Roman" w:hAnsi="Times New Roman" w:cs="Times New Roman"/>
           <w:sz w:val="28"/>
           <w:szCs w:val="28"/>
           <w:lang w:val="es-ES"/>
         </w:rPr>
-      </w:pPr>
-      <w:r>
+        <w:tab/>
+      </w:r>
+    </w:p>
+    <w:p>
+      <w:pPr>
+        <w:jc w:val="both"/>
         <w:rPr>
           <w:rFonts w:ascii="Times New Roman" w:hAnsi="Times New Roman" w:cs="Times New Roman"/>
           <w:sz w:val="28"/>
           <w:szCs w:val="28"/>
           <w:lang w:val="es-ES"/>
         </w:rPr>
-        <w:tab/>
-      </w:r>
-    </w:p>
-    <w:p>
-      <w:pPr>
-        <w:jc w:val="both"/>
+      </w:pPr>
+      <w:r>
         <w:rPr>
           <w:rFonts w:ascii="Times New Roman" w:hAnsi="Times New Roman" w:cs="Times New Roman"/>
           <w:sz w:val="28"/>
           <w:szCs w:val="28"/>
           <w:lang w:val="es-ES"/>
         </w:rPr>
-      </w:pPr>
-      <w:r>
-        <w:rPr>
-          <w:rFonts w:ascii="Times New Roman" w:hAnsi="Times New Roman" w:cs="Times New Roman"/>
-          <w:sz w:val="28"/>
-          <w:szCs w:val="28"/>
-          <w:lang w:val="es-ES"/>
-        </w:rPr>
         <w:t xml:space="preserve">Enlace del repositorio: </w:t>
       </w:r>
-    </w:p>
-    <w:p>
-      <w:pPr>
-        <w:ind w:left="708" w:hanging="708"/>
-        <w:jc w:val="center"/>
+      <w:hyperlink r:id="rId7" w:history="1">
+        <w:r>
+          <w:rPr>
+            <w:rStyle w:val="Hipervnculo"/>
+            <w:rFonts w:ascii="Times New Roman" w:hAnsi="Times New Roman" w:cs="Times New Roman"/>
+            <w:sz w:val="28"/>
+            <w:szCs w:val="28"/>
+            <w:lang w:val="es-ES"/>
+          </w:rPr>
+          <w:t>https://github.com/Kevin-RiveraS/Programacion-II-2026/tree/main/Proyecto%20Final%20-%20Backend%20-%20Reservas%20de%20Mesas%20para%20Restaurante/restaurante</w:t>
+        </w:r>
+      </w:hyperlink>
+    </w:p>
+    <w:p>
+      <w:pPr>
+        <w:jc w:val="both"/>
         <w:rPr>
           <w:rFonts w:ascii="Times New Roman" w:hAnsi="Times New Roman" w:cs="Times New Roman"/>
           <w:sz w:val="28"/>
@@ -794,7 +791,7 @@
                     </pic:cNvPicPr>
                   </pic:nvPicPr>
                   <pic:blipFill>
-                    <a:blip r:embed="rId6">
+                    <a:blip r:embed="rId8">
                       <a:extLst>
                         <a:ext uri="{28A0092B-C50C-407E-A947-70E740481C1C}">
                           <a14:useLocalDpi xmlns:a14="http://schemas.microsoft.com/office/drawing/2010/main" val="0"/>
@@ -904,7 +901,7 @@
                     <pic:cNvPicPr/>
                   </pic:nvPicPr>
                   <pic:blipFill>
-                    <a:blip r:embed="rId7">
+                    <a:blip r:embed="rId9">
                       <a:extLst>
                         <a:ext uri="{28A0092B-C50C-407E-A947-70E740481C1C}">
                           <a14:useLocalDpi xmlns:a14="http://schemas.microsoft.com/office/drawing/2010/main" val="0"/>
@@ -1006,7 +1003,7 @@
                     </pic:cNvPicPr>
                   </pic:nvPicPr>
                   <pic:blipFill>
-                    <a:blip r:embed="rId8">
+                    <a:blip r:embed="rId10">
                       <a:extLst>
                         <a:ext uri="{28A0092B-C50C-407E-A947-70E740481C1C}">
                           <a14:useLocalDpi xmlns:a14="http://schemas.microsoft.com/office/drawing/2010/main" val="0"/>
@@ -1073,11 +1070,6 @@
     </w:p>
     <w:p>
       <w:pPr>
-        <w:jc w:val="both"/>
-      </w:pPr>
-    </w:p>
-    <w:p>
-      <w:pPr>
         <w:pStyle w:val="Prrafodelista"/>
         <w:numPr>
           <w:ilvl w:val="0"/>
@@ -1085,29 +1077,334 @@
         </w:numPr>
         <w:jc w:val="both"/>
       </w:pPr>
+    </w:p>
+    <w:p>
+      <w:pPr>
+        <w:pStyle w:val="Prrafodelista"/>
+        <w:numPr>
+          <w:ilvl w:val="0"/>
+          <w:numId w:val="3"/>
+        </w:numPr>
+      </w:pPr>
       <w:r>
         <w:lastRenderedPageBreak/>
         <w:t xml:space="preserve">Datos de los registros en </w:t>
       </w:r>
       <w:proofErr w:type="spellStart"/>
       <w:r>
-        <w:t>PostgresSQL</w:t>
+        <w:t>PostgresSQ</w:t>
+      </w:r>
+      <w:r>
+        <w:t>L</w:t>
       </w:r>
       <w:proofErr w:type="spellEnd"/>
     </w:p>
     <w:p>
       <w:pPr>
+        <w:pStyle w:val="Prrafodelista"/>
+        <w:numPr>
+          <w:ilvl w:val="0"/>
+          <w:numId w:val="4"/>
+        </w:numPr>
         <w:jc w:val="both"/>
       </w:pPr>
       <w:r>
         <w:drawing>
-          <wp:anchor distT="0" distB="0" distL="114300" distR="114300" simplePos="0" relativeHeight="251664384" behindDoc="0" locked="0" layoutInCell="1" allowOverlap="1" wp14:anchorId="6035C4BF" wp14:editId="4A68EA4C">
+          <wp:anchor distT="0" distB="0" distL="114300" distR="114300" simplePos="0" relativeHeight="251666432" behindDoc="0" locked="0" layoutInCell="1" allowOverlap="1" wp14:anchorId="6E6B1B0D" wp14:editId="54506C38">
             <wp:simplePos x="0" y="0"/>
             <wp:positionH relativeFrom="margin">
               <wp:align>right</wp:align>
             </wp:positionH>
             <wp:positionV relativeFrom="paragraph">
-              <wp:posOffset>4896</wp:posOffset>
+              <wp:posOffset>325120</wp:posOffset>
+            </wp:positionV>
+            <wp:extent cx="5600700" cy="3169920"/>
+            <wp:effectExtent l="0" t="0" r="0" b="0"/>
+            <wp:wrapNone/>
+            <wp:docPr id="15875991" name="Imagen 1"/>
+            <wp:cNvGraphicFramePr>
+              <a:graphicFrameLocks xmlns:a="http://schemas.openxmlformats.org/drawingml/2006/main" noChangeAspect="1"/>
+            </wp:cNvGraphicFramePr>
+            <a:graphic xmlns:a="http://schemas.openxmlformats.org/drawingml/2006/main">
+              <a:graphicData uri="http://schemas.openxmlformats.org/drawingml/2006/picture">
+                <pic:pic xmlns:pic="http://schemas.openxmlformats.org/drawingml/2006/picture">
+                  <pic:nvPicPr>
+                    <pic:cNvPr id="15875991" name=""/>
+                    <pic:cNvPicPr/>
+                  </pic:nvPicPr>
+                  <pic:blipFill>
+                    <a:blip r:embed="rId11">
+                      <a:extLst>
+                        <a:ext uri="{28A0092B-C50C-407E-A947-70E740481C1C}">
+                          <a14:useLocalDpi xmlns:a14="http://schemas.microsoft.com/office/drawing/2010/main" val="0"/>
+                        </a:ext>
+                      </a:extLst>
+                    </a:blip>
+                    <a:stretch>
+                      <a:fillRect/>
+                    </a:stretch>
+                  </pic:blipFill>
+                  <pic:spPr>
+                    <a:xfrm>
+                      <a:off x="0" y="0"/>
+                      <a:ext cx="5600700" cy="3169920"/>
+                    </a:xfrm>
+                    <a:prstGeom prst="rect">
+                      <a:avLst/>
+                    </a:prstGeom>
+                  </pic:spPr>
+                </pic:pic>
+              </a:graphicData>
+            </a:graphic>
+            <wp14:sizeRelH relativeFrom="page">
+              <wp14:pctWidth>0</wp14:pctWidth>
+            </wp14:sizeRelH>
+            <wp14:sizeRelV relativeFrom="page">
+              <wp14:pctHeight>0</wp14:pctHeight>
+            </wp14:sizeRelV>
+          </wp:anchor>
+        </w:drawing>
+      </w:r>
+      <w:r>
+        <w:t xml:space="preserve"> </w:t>
+      </w:r>
+      <w:r>
+        <w:t>Script de creación de la estructura</w:t>
+      </w:r>
+    </w:p>
+    <w:p>
+      <w:pPr>
+        <w:jc w:val="both"/>
+      </w:pPr>
+    </w:p>
+    <w:p>
+      <w:pPr>
+        <w:pStyle w:val="Prrafodelista"/>
+        <w:jc w:val="both"/>
+      </w:pPr>
+    </w:p>
+    <w:p>
+      <w:pPr>
+        <w:pStyle w:val="Prrafodelista"/>
+        <w:jc w:val="both"/>
+      </w:pPr>
+    </w:p>
+    <w:p>
+      <w:pPr>
+        <w:pStyle w:val="Prrafodelista"/>
+        <w:jc w:val="both"/>
+      </w:pPr>
+    </w:p>
+    <w:p>
+      <w:pPr>
+        <w:pStyle w:val="Prrafodelista"/>
+        <w:jc w:val="both"/>
+      </w:pPr>
+    </w:p>
+    <w:p>
+      <w:pPr>
+        <w:pStyle w:val="Prrafodelista"/>
+        <w:jc w:val="both"/>
+      </w:pPr>
+    </w:p>
+    <w:p>
+      <w:pPr>
+        <w:pStyle w:val="Prrafodelista"/>
+        <w:jc w:val="both"/>
+      </w:pPr>
+    </w:p>
+    <w:p>
+      <w:pPr>
+        <w:pStyle w:val="Prrafodelista"/>
+        <w:jc w:val="both"/>
+      </w:pPr>
+    </w:p>
+    <w:p>
+      <w:pPr>
+        <w:pStyle w:val="Prrafodelista"/>
+        <w:jc w:val="both"/>
+      </w:pPr>
+    </w:p>
+    <w:p>
+      <w:pPr>
+        <w:ind w:left="360"/>
+        <w:jc w:val="both"/>
+      </w:pPr>
+    </w:p>
+    <w:p>
+      <w:pPr>
+        <w:pStyle w:val="Prrafodelista"/>
+        <w:jc w:val="both"/>
+      </w:pPr>
+    </w:p>
+    <w:p>
+      <w:pPr>
+        <w:pStyle w:val="Prrafodelista"/>
+        <w:jc w:val="both"/>
+      </w:pPr>
+    </w:p>
+    <w:p>
+      <w:pPr>
+        <w:jc w:val="both"/>
+      </w:pPr>
+    </w:p>
+    <w:p>
+      <w:pPr>
+        <w:jc w:val="both"/>
+      </w:pPr>
+    </w:p>
+    <w:p>
+      <w:pPr>
+        <w:pStyle w:val="Prrafodelista"/>
+        <w:numPr>
+          <w:ilvl w:val="0"/>
+          <w:numId w:val="4"/>
+        </w:numPr>
+        <w:jc w:val="both"/>
+      </w:pPr>
+      <w:r>
+        <w:drawing>
+          <wp:anchor distT="0" distB="0" distL="114300" distR="114300" simplePos="0" relativeHeight="251667456" behindDoc="0" locked="0" layoutInCell="1" allowOverlap="1" wp14:anchorId="28E7B74F" wp14:editId="0A0BF89D">
+            <wp:simplePos x="0" y="0"/>
+            <wp:positionH relativeFrom="margin">
+              <wp:align>right</wp:align>
+            </wp:positionH>
+            <wp:positionV relativeFrom="paragraph">
+              <wp:posOffset>330835</wp:posOffset>
+            </wp:positionV>
+            <wp:extent cx="5600700" cy="3049905"/>
+            <wp:effectExtent l="0" t="0" r="0" b="0"/>
+            <wp:wrapNone/>
+            <wp:docPr id="598831867" name="Imagen 1"/>
+            <wp:cNvGraphicFramePr>
+              <a:graphicFrameLocks xmlns:a="http://schemas.openxmlformats.org/drawingml/2006/main" noChangeAspect="1"/>
+            </wp:cNvGraphicFramePr>
+            <a:graphic xmlns:a="http://schemas.openxmlformats.org/drawingml/2006/main">
+              <a:graphicData uri="http://schemas.openxmlformats.org/drawingml/2006/picture">
+                <pic:pic xmlns:pic="http://schemas.openxmlformats.org/drawingml/2006/picture">
+                  <pic:nvPicPr>
+                    <pic:cNvPr id="598831867" name=""/>
+                    <pic:cNvPicPr/>
+                  </pic:nvPicPr>
+                  <pic:blipFill>
+                    <a:blip r:embed="rId12">
+                      <a:extLst>
+                        <a:ext uri="{28A0092B-C50C-407E-A947-70E740481C1C}">
+                          <a14:useLocalDpi xmlns:a14="http://schemas.microsoft.com/office/drawing/2010/main" val="0"/>
+                        </a:ext>
+                      </a:extLst>
+                    </a:blip>
+                    <a:stretch>
+                      <a:fillRect/>
+                    </a:stretch>
+                  </pic:blipFill>
+                  <pic:spPr>
+                    <a:xfrm>
+                      <a:off x="0" y="0"/>
+                      <a:ext cx="5600700" cy="3049905"/>
+                    </a:xfrm>
+                    <a:prstGeom prst="rect">
+                      <a:avLst/>
+                    </a:prstGeom>
+                  </pic:spPr>
+                </pic:pic>
+              </a:graphicData>
+            </a:graphic>
+            <wp14:sizeRelH relativeFrom="page">
+              <wp14:pctWidth>0</wp14:pctWidth>
+            </wp14:sizeRelH>
+            <wp14:sizeRelV relativeFrom="page">
+              <wp14:pctHeight>0</wp14:pctHeight>
+            </wp14:sizeRelV>
+          </wp:anchor>
+        </w:drawing>
+      </w:r>
+      <w:r>
+        <w:t>Script con datos de prueba</w:t>
+      </w:r>
+    </w:p>
+    <w:p>
+      <w:pPr>
+        <w:jc w:val="both"/>
+      </w:pPr>
+    </w:p>
+    <w:p>
+      <w:pPr>
+        <w:jc w:val="both"/>
+      </w:pPr>
+    </w:p>
+    <w:p>
+      <w:pPr>
+        <w:jc w:val="both"/>
+      </w:pPr>
+    </w:p>
+    <w:p>
+      <w:pPr>
+        <w:jc w:val="both"/>
+      </w:pPr>
+    </w:p>
+    <w:p>
+      <w:pPr>
+        <w:jc w:val="both"/>
+      </w:pPr>
+    </w:p>
+    <w:p>
+      <w:pPr>
+        <w:jc w:val="both"/>
+      </w:pPr>
+    </w:p>
+    <w:p>
+      <w:pPr>
+        <w:jc w:val="both"/>
+      </w:pPr>
+    </w:p>
+    <w:p>
+      <w:pPr>
+        <w:jc w:val="both"/>
+      </w:pPr>
+    </w:p>
+    <w:p>
+      <w:pPr>
+        <w:jc w:val="both"/>
+      </w:pPr>
+    </w:p>
+    <w:p>
+      <w:pPr>
+        <w:jc w:val="both"/>
+      </w:pPr>
+    </w:p>
+    <w:p>
+      <w:pPr>
+        <w:jc w:val="both"/>
+      </w:pPr>
+    </w:p>
+    <w:p>
+      <w:pPr>
+        <w:jc w:val="both"/>
+      </w:pPr>
+    </w:p>
+    <w:p>
+      <w:pPr>
+        <w:pStyle w:val="Prrafodelista"/>
+        <w:numPr>
+          <w:ilvl w:val="0"/>
+          <w:numId w:val="4"/>
+        </w:numPr>
+        <w:jc w:val="both"/>
+      </w:pPr>
+      <w:r>
+        <w:rPr>
+          <w:noProof/>
+        </w:rPr>
+        <w:lastRenderedPageBreak/>
+        <w:drawing>
+          <wp:anchor distT="0" distB="0" distL="114300" distR="114300" simplePos="0" relativeHeight="251664384" behindDoc="0" locked="0" layoutInCell="1" allowOverlap="1" wp14:anchorId="6035C4BF" wp14:editId="1AD8D10A">
+            <wp:simplePos x="0" y="0"/>
+            <wp:positionH relativeFrom="margin">
+              <wp:align>right</wp:align>
+            </wp:positionH>
+            <wp:positionV relativeFrom="paragraph">
+              <wp:posOffset>232410</wp:posOffset>
             </wp:positionV>
             <wp:extent cx="5607685" cy="3550654"/>
             <wp:effectExtent l="0" t="0" r="0" b="0"/>
@@ -1124,7 +1421,7 @@
                     <pic:cNvPicPr/>
                   </pic:nvPicPr>
                   <pic:blipFill>
-                    <a:blip r:embed="rId9">
+                    <a:blip r:embed="rId13">
                       <a:extLst>
                         <a:ext uri="{28A0092B-C50C-407E-A947-70E740481C1C}">
                           <a14:useLocalDpi xmlns:a14="http://schemas.microsoft.com/office/drawing/2010/main" val="0"/>
@@ -1156,56 +1453,98 @@
           </wp:anchor>
         </w:drawing>
       </w:r>
-    </w:p>
-    <w:p>
-      <w:pPr>
-        <w:jc w:val="both"/>
-      </w:pPr>
-    </w:p>
-    <w:p>
-      <w:pPr>
-        <w:jc w:val="both"/>
-      </w:pPr>
-    </w:p>
-    <w:p>
-      <w:pPr>
-        <w:jc w:val="both"/>
-      </w:pPr>
-    </w:p>
-    <w:p>
-      <w:pPr>
-        <w:jc w:val="both"/>
-      </w:pPr>
-    </w:p>
-    <w:p>
-      <w:pPr>
-        <w:jc w:val="both"/>
-      </w:pPr>
-    </w:p>
-    <w:p>
-      <w:pPr>
-        <w:jc w:val="both"/>
-      </w:pPr>
-    </w:p>
-    <w:p>
-      <w:pPr>
-        <w:jc w:val="both"/>
-      </w:pPr>
-    </w:p>
-    <w:p>
-      <w:pPr>
-        <w:jc w:val="both"/>
-      </w:pPr>
-    </w:p>
-    <w:p>
-      <w:pPr>
-        <w:jc w:val="both"/>
-      </w:pPr>
-    </w:p>
-    <w:p>
-      <w:pPr>
-        <w:jc w:val="both"/>
-      </w:pPr>
+      <w:r>
+        <w:t>Al menos diez registros para la entidad principal</w:t>
+      </w:r>
+      <w:r>
+        <w:t xml:space="preserve"> </w:t>
+      </w:r>
+      <w:r>
+        <w:t>–</w:t>
+      </w:r>
+      <w:r>
+        <w:t xml:space="preserve"> Mesa</w:t>
+      </w:r>
+      <w:r>
+        <w:t>, datos de prueba</w:t>
+      </w:r>
+    </w:p>
+    <w:p>
+      <w:pPr>
+        <w:jc w:val="both"/>
+      </w:pPr>
+    </w:p>
+    <w:p>
+      <w:pPr>
+        <w:jc w:val="both"/>
+      </w:pPr>
+    </w:p>
+    <w:p>
+      <w:pPr>
+        <w:jc w:val="both"/>
+      </w:pPr>
+    </w:p>
+    <w:p>
+      <w:pPr>
+        <w:jc w:val="both"/>
+      </w:pPr>
+    </w:p>
+    <w:p>
+      <w:pPr>
+        <w:jc w:val="both"/>
+      </w:pPr>
+    </w:p>
+    <w:p>
+      <w:pPr>
+        <w:jc w:val="both"/>
+      </w:pPr>
+    </w:p>
+    <w:p>
+      <w:pPr>
+        <w:jc w:val="both"/>
+      </w:pPr>
+    </w:p>
+    <w:p>
+      <w:pPr>
+        <w:jc w:val="both"/>
+      </w:pPr>
+    </w:p>
+    <w:p>
+      <w:pPr>
+        <w:jc w:val="both"/>
+      </w:pPr>
+    </w:p>
+    <w:p>
+      <w:pPr>
+        <w:jc w:val="both"/>
+      </w:pPr>
+    </w:p>
+    <w:p>
+      <w:pPr>
+        <w:jc w:val="both"/>
+      </w:pPr>
+    </w:p>
+    <w:p>
+      <w:pPr>
+        <w:pStyle w:val="Prrafodelista"/>
+        <w:numPr>
+          <w:ilvl w:val="0"/>
+          <w:numId w:val="5"/>
+        </w:numPr>
+        <w:jc w:val="both"/>
+      </w:pPr>
+      <w:r>
+        <w:t>Al menos cuatro registros para la entidad de apoyo</w:t>
+      </w:r>
+      <w:r>
+        <w:t xml:space="preserve"> - Reserva</w:t>
+      </w:r>
+      <w:r>
+        <w:t>, cuando el caso lo permita</w:t>
+      </w:r>
+      <w:r>
+        <w:t>, datos de prueba</w:t>
+      </w:r>
     </w:p>
     <w:p>
       <w:pPr>
@@ -1216,16 +1555,16 @@
           <w:noProof/>
         </w:rPr>
         <w:drawing>
-          <wp:anchor distT="0" distB="0" distL="114300" distR="114300" simplePos="0" relativeHeight="251665408" behindDoc="0" locked="0" layoutInCell="1" allowOverlap="1" wp14:anchorId="581AD515" wp14:editId="09DC07FB">
+          <wp:anchor distT="0" distB="0" distL="114300" distR="114300" simplePos="0" relativeHeight="251665408" behindDoc="0" locked="0" layoutInCell="1" allowOverlap="1" wp14:anchorId="581AD515" wp14:editId="1837214D">
             <wp:simplePos x="0" y="0"/>
             <wp:positionH relativeFrom="margin">
-              <wp:posOffset>-395896</wp:posOffset>
+              <wp:align>center</wp:align>
             </wp:positionH>
             <wp:positionV relativeFrom="paragraph">
-              <wp:posOffset>242831</wp:posOffset>
+              <wp:posOffset>91440</wp:posOffset>
             </wp:positionV>
-            <wp:extent cx="6356784" cy="3092450"/>
-            <wp:effectExtent l="0" t="0" r="6350" b="0"/>
+            <wp:extent cx="6356350" cy="3649980"/>
+            <wp:effectExtent l="0" t="0" r="6350" b="7620"/>
             <wp:wrapNone/>
             <wp:docPr id="218603436" name="Imagen 1"/>
             <wp:cNvGraphicFramePr>
@@ -1241,7 +1580,7 @@
                     </pic:cNvPicPr>
                   </pic:nvPicPr>
                   <pic:blipFill>
-                    <a:blip r:embed="rId10">
+                    <a:blip r:embed="rId14">
                       <a:extLst>
                         <a:ext uri="{28A0092B-C50C-407E-A947-70E740481C1C}">
                           <a14:useLocalDpi xmlns:a14="http://schemas.microsoft.com/office/drawing/2010/main" val="0"/>
@@ -1256,7 +1595,7 @@
                   <pic:spPr bwMode="auto">
                     <a:xfrm>
                       <a:off x="0" y="0"/>
-                      <a:ext cx="6356784" cy="3092450"/>
+                      <a:ext cx="6356350" cy="3649980"/>
                     </a:xfrm>
                     <a:prstGeom prst="rect">
                       <a:avLst/>
@@ -1333,16 +1672,6 @@
     </w:p>
     <w:p>
       <w:pPr>
-        <w:jc w:val="both"/>
-      </w:pPr>
-    </w:p>
-    <w:p>
-      <w:pPr>
-        <w:jc w:val="both"/>
-      </w:pPr>
-    </w:p>
-    <w:p>
-      <w:pPr>
         <w:pStyle w:val="Prrafodelista"/>
         <w:numPr>
           <w:ilvl w:val="0"/>
@@ -1351,34 +1680,21 @@
         <w:jc w:val="both"/>
       </w:pPr>
       <w:r>
+        <w:rPr>
+          <w:noProof/>
+        </w:rPr>
         <w:lastRenderedPageBreak/>
-        <w:t>Evidencias de la conexión con PostgreSQL</w:t>
-      </w:r>
-    </w:p>
-    <w:p>
-      <w:pPr>
-        <w:jc w:val="both"/>
-      </w:pPr>
-    </w:p>
-    <w:p>
-      <w:pPr>
-        <w:jc w:val="both"/>
-      </w:pPr>
-      <w:r>
-        <w:rPr>
-          <w:noProof/>
-        </w:rPr>
         <w:drawing>
-          <wp:anchor distT="0" distB="0" distL="114300" distR="114300" simplePos="0" relativeHeight="251663360" behindDoc="0" locked="0" layoutInCell="1" allowOverlap="1" wp14:anchorId="11BC233C" wp14:editId="6B03536D">
+          <wp:anchor distT="0" distB="0" distL="114300" distR="114300" simplePos="0" relativeHeight="251663360" behindDoc="0" locked="0" layoutInCell="1" allowOverlap="1" wp14:anchorId="11BC233C" wp14:editId="557D9E1F">
             <wp:simplePos x="0" y="0"/>
             <wp:positionH relativeFrom="margin">
-              <wp:align>right</wp:align>
+              <wp:posOffset>-310515</wp:posOffset>
             </wp:positionH>
             <wp:positionV relativeFrom="paragraph">
-              <wp:posOffset>15240</wp:posOffset>
+              <wp:posOffset>342265</wp:posOffset>
             </wp:positionV>
-            <wp:extent cx="5612130" cy="2927985"/>
-            <wp:effectExtent l="0" t="0" r="7620" b="5715"/>
+            <wp:extent cx="6332220" cy="3947160"/>
+            <wp:effectExtent l="0" t="0" r="0" b="0"/>
             <wp:wrapNone/>
             <wp:docPr id="852390843" name="Imagen 1"/>
             <wp:cNvGraphicFramePr>
@@ -1392,7 +1708,7 @@
                     <pic:cNvPicPr/>
                   </pic:nvPicPr>
                   <pic:blipFill>
-                    <a:blip r:embed="rId11" cstate="print">
+                    <a:blip r:embed="rId15" cstate="print">
                       <a:extLst>
                         <a:ext uri="{28A0092B-C50C-407E-A947-70E740481C1C}">
                           <a14:useLocalDpi xmlns:a14="http://schemas.microsoft.com/office/drawing/2010/main" val="0"/>
@@ -1406,7 +1722,7 @@
                   <pic:spPr>
                     <a:xfrm>
                       <a:off x="0" y="0"/>
-                      <a:ext cx="5612130" cy="2927985"/>
+                      <a:ext cx="6332220" cy="3947160"/>
                     </a:xfrm>
                     <a:prstGeom prst="rect">
                       <a:avLst/>
@@ -1424,74 +1740,1472 @@
           </wp:anchor>
         </w:drawing>
       </w:r>
-    </w:p>
-    <w:p>
-      <w:pPr>
-        <w:jc w:val="both"/>
-      </w:pPr>
-    </w:p>
-    <w:p>
-      <w:pPr>
-        <w:jc w:val="both"/>
-      </w:pPr>
-    </w:p>
-    <w:p>
-      <w:pPr>
-        <w:jc w:val="both"/>
-      </w:pPr>
-    </w:p>
-    <w:p>
-      <w:pPr>
-        <w:jc w:val="both"/>
-      </w:pPr>
-    </w:p>
-    <w:p>
-      <w:pPr>
-        <w:jc w:val="both"/>
-      </w:pPr>
-    </w:p>
-    <w:p>
-      <w:pPr>
-        <w:jc w:val="both"/>
-      </w:pPr>
-    </w:p>
-    <w:p>
-      <w:pPr>
-        <w:jc w:val="both"/>
-      </w:pPr>
-    </w:p>
-    <w:p>
-      <w:pPr>
-        <w:jc w:val="both"/>
-      </w:pPr>
-    </w:p>
-    <w:p>
-      <w:pPr>
-        <w:jc w:val="both"/>
-      </w:pPr>
-    </w:p>
-    <w:p>
-      <w:pPr>
-        <w:jc w:val="both"/>
-      </w:pPr>
-    </w:p>
-    <w:p>
-      <w:pPr>
-        <w:jc w:val="both"/>
-      </w:pPr>
-    </w:p>
-    <w:p>
-      <w:pPr>
-        <w:jc w:val="both"/>
-      </w:pPr>
-    </w:p>
-    <w:p>
-      <w:pPr>
-        <w:jc w:val="both"/>
-      </w:pPr>
-    </w:p>
-    <w:p/>
-    <w:p/>
+      <w:r>
+        <w:t>Evidencias de la conexión con PostgreSQL</w:t>
+      </w:r>
+    </w:p>
+    <w:p>
+      <w:pPr>
+        <w:jc w:val="both"/>
+      </w:pPr>
+    </w:p>
+    <w:p>
+      <w:pPr>
+        <w:jc w:val="both"/>
+      </w:pPr>
+    </w:p>
+    <w:p>
+      <w:pPr>
+        <w:jc w:val="both"/>
+      </w:pPr>
+    </w:p>
+    <w:p>
+      <w:pPr>
+        <w:jc w:val="both"/>
+      </w:pPr>
+    </w:p>
+    <w:p>
+      <w:pPr>
+        <w:jc w:val="both"/>
+      </w:pPr>
+    </w:p>
+    <w:p>
+      <w:pPr>
+        <w:jc w:val="both"/>
+      </w:pPr>
+    </w:p>
+    <w:p>
+      <w:pPr>
+        <w:jc w:val="both"/>
+      </w:pPr>
+    </w:p>
+    <w:p>
+      <w:pPr>
+        <w:jc w:val="both"/>
+      </w:pPr>
+    </w:p>
+    <w:p>
+      <w:pPr>
+        <w:jc w:val="both"/>
+      </w:pPr>
+    </w:p>
+    <w:p>
+      <w:pPr>
+        <w:jc w:val="both"/>
+      </w:pPr>
+    </w:p>
+    <w:p>
+      <w:pPr>
+        <w:jc w:val="both"/>
+      </w:pPr>
+    </w:p>
+    <w:p>
+      <w:pPr>
+        <w:jc w:val="both"/>
+      </w:pPr>
+    </w:p>
+    <w:p>
+      <w:pPr>
+        <w:jc w:val="both"/>
+      </w:pPr>
+    </w:p>
+    <w:p>
+      <w:pPr>
+        <w:jc w:val="both"/>
+      </w:pPr>
+    </w:p>
+    <w:p>
+      <w:pPr>
+        <w:jc w:val="both"/>
+      </w:pPr>
+    </w:p>
+    <w:p/>
+    <w:p/>
+    <w:p/>
+    <w:p/>
+    <w:p/>
+    <w:p/>
+    <w:p/>
+    <w:p/>
+    <w:p/>
+    <w:p/>
+    <w:p>
+      <w:pPr>
+        <w:pStyle w:val="Prrafodelista"/>
+        <w:numPr>
+          <w:ilvl w:val="0"/>
+          <w:numId w:val="2"/>
+        </w:numPr>
+      </w:pPr>
+      <w:proofErr w:type="spellStart"/>
+      <w:r>
+        <w:lastRenderedPageBreak/>
+        <w:t>Backend</w:t>
+      </w:r>
+      <w:proofErr w:type="spellEnd"/>
+    </w:p>
+    <w:p>
+      <w:pPr>
+        <w:pStyle w:val="Prrafodelista"/>
+        <w:numPr>
+          <w:ilvl w:val="0"/>
+          <w:numId w:val="5"/>
+        </w:numPr>
+      </w:pPr>
+      <w:r>
+        <w:t>Paquetes creados</w:t>
+      </w:r>
+    </w:p>
+    <w:p>
+      <w:r>
+        <w:drawing>
+          <wp:anchor distT="0" distB="0" distL="114300" distR="114300" simplePos="0" relativeHeight="251668480" behindDoc="0" locked="0" layoutInCell="1" allowOverlap="1" wp14:anchorId="4706304F" wp14:editId="0CE6F77A">
+            <wp:simplePos x="0" y="0"/>
+            <wp:positionH relativeFrom="margin">
+              <wp:align>right</wp:align>
+            </wp:positionH>
+            <wp:positionV relativeFrom="paragraph">
+              <wp:posOffset>7620</wp:posOffset>
+            </wp:positionV>
+            <wp:extent cx="5606415" cy="3288146"/>
+            <wp:effectExtent l="0" t="0" r="0" b="7620"/>
+            <wp:wrapNone/>
+            <wp:docPr id="2123042147" name="Imagen 1"/>
+            <wp:cNvGraphicFramePr>
+              <a:graphicFrameLocks xmlns:a="http://schemas.openxmlformats.org/drawingml/2006/main" noChangeAspect="1"/>
+            </wp:cNvGraphicFramePr>
+            <a:graphic xmlns:a="http://schemas.openxmlformats.org/drawingml/2006/main">
+              <a:graphicData uri="http://schemas.openxmlformats.org/drawingml/2006/picture">
+                <pic:pic xmlns:pic="http://schemas.openxmlformats.org/drawingml/2006/picture">
+                  <pic:nvPicPr>
+                    <pic:cNvPr id="0" name="Picture 1"/>
+                    <pic:cNvPicPr>
+                      <a:picLocks noChangeAspect="1" noChangeArrowheads="1"/>
+                    </pic:cNvPicPr>
+                  </pic:nvPicPr>
+                  <pic:blipFill>
+                    <a:blip r:embed="rId16">
+                      <a:extLst>
+                        <a:ext uri="{28A0092B-C50C-407E-A947-70E740481C1C}">
+                          <a14:useLocalDpi xmlns:a14="http://schemas.microsoft.com/office/drawing/2010/main" val="0"/>
+                        </a:ext>
+                      </a:extLst>
+                    </a:blip>
+                    <a:srcRect/>
+                    <a:stretch>
+                      <a:fillRect/>
+                    </a:stretch>
+                  </pic:blipFill>
+                  <pic:spPr bwMode="auto">
+                    <a:xfrm>
+                      <a:off x="0" y="0"/>
+                      <a:ext cx="5608986" cy="3289654"/>
+                    </a:xfrm>
+                    <a:prstGeom prst="rect">
+                      <a:avLst/>
+                    </a:prstGeom>
+                    <a:noFill/>
+                    <a:ln>
+                      <a:noFill/>
+                    </a:ln>
+                  </pic:spPr>
+                </pic:pic>
+              </a:graphicData>
+            </a:graphic>
+            <wp14:sizeRelH relativeFrom="page">
+              <wp14:pctWidth>0</wp14:pctWidth>
+            </wp14:sizeRelH>
+            <wp14:sizeRelV relativeFrom="page">
+              <wp14:pctHeight>0</wp14:pctHeight>
+            </wp14:sizeRelV>
+          </wp:anchor>
+        </w:drawing>
+      </w:r>
+    </w:p>
+    <w:p/>
+    <w:p/>
+    <w:p/>
+    <w:p/>
+    <w:p/>
+    <w:p/>
+    <w:p/>
+    <w:p/>
+    <w:p/>
+    <w:p/>
+    <w:p>
+      <w:r>
+        <w:drawing>
+          <wp:anchor distT="0" distB="0" distL="114300" distR="114300" simplePos="0" relativeHeight="251669504" behindDoc="0" locked="0" layoutInCell="1" allowOverlap="1" wp14:anchorId="6ABDC7ED" wp14:editId="793055AB">
+            <wp:simplePos x="0" y="0"/>
+            <wp:positionH relativeFrom="margin">
+              <wp:align>right</wp:align>
+            </wp:positionH>
+            <wp:positionV relativeFrom="paragraph">
+              <wp:posOffset>40005</wp:posOffset>
+            </wp:positionV>
+            <wp:extent cx="5612130" cy="2853690"/>
+            <wp:effectExtent l="0" t="0" r="7620" b="3810"/>
+            <wp:wrapNone/>
+            <wp:docPr id="688836758" name="Imagen 2"/>
+            <wp:cNvGraphicFramePr>
+              <a:graphicFrameLocks xmlns:a="http://schemas.openxmlformats.org/drawingml/2006/main" noChangeAspect="1"/>
+            </wp:cNvGraphicFramePr>
+            <a:graphic xmlns:a="http://schemas.openxmlformats.org/drawingml/2006/main">
+              <a:graphicData uri="http://schemas.openxmlformats.org/drawingml/2006/picture">
+                <pic:pic xmlns:pic="http://schemas.openxmlformats.org/drawingml/2006/picture">
+                  <pic:nvPicPr>
+                    <pic:cNvPr id="0" name="Picture 3"/>
+                    <pic:cNvPicPr>
+                      <a:picLocks noChangeAspect="1" noChangeArrowheads="1"/>
+                    </pic:cNvPicPr>
+                  </pic:nvPicPr>
+                  <pic:blipFill>
+                    <a:blip r:embed="rId17" cstate="print">
+                      <a:extLst>
+                        <a:ext uri="{28A0092B-C50C-407E-A947-70E740481C1C}">
+                          <a14:useLocalDpi xmlns:a14="http://schemas.microsoft.com/office/drawing/2010/main" val="0"/>
+                        </a:ext>
+                      </a:extLst>
+                    </a:blip>
+                    <a:srcRect/>
+                    <a:stretch>
+                      <a:fillRect/>
+                    </a:stretch>
+                  </pic:blipFill>
+                  <pic:spPr bwMode="auto">
+                    <a:xfrm>
+                      <a:off x="0" y="0"/>
+                      <a:ext cx="5612130" cy="2853690"/>
+                    </a:xfrm>
+                    <a:prstGeom prst="rect">
+                      <a:avLst/>
+                    </a:prstGeom>
+                    <a:noFill/>
+                    <a:ln>
+                      <a:noFill/>
+                    </a:ln>
+                  </pic:spPr>
+                </pic:pic>
+              </a:graphicData>
+            </a:graphic>
+            <wp14:sizeRelH relativeFrom="page">
+              <wp14:pctWidth>0</wp14:pctWidth>
+            </wp14:sizeRelH>
+            <wp14:sizeRelV relativeFrom="page">
+              <wp14:pctHeight>0</wp14:pctHeight>
+            </wp14:sizeRelV>
+          </wp:anchor>
+        </w:drawing>
+      </w:r>
+    </w:p>
+    <w:p/>
+    <w:p/>
+    <w:p/>
+    <w:p/>
+    <w:p/>
+    <w:p/>
+    <w:p/>
+    <w:p/>
+    <w:p/>
+    <w:p/>
+    <w:p/>
+    <w:p/>
+    <w:p>
+      <w:pPr>
+        <w:pStyle w:val="Prrafodelista"/>
+        <w:numPr>
+          <w:ilvl w:val="0"/>
+          <w:numId w:val="5"/>
+        </w:numPr>
+      </w:pPr>
+      <w:r>
+        <w:lastRenderedPageBreak/>
+        <w:t>Paquetes creados</w:t>
+      </w:r>
+    </w:p>
+    <w:p>
+      <w:pPr>
+        <w:ind w:firstLine="708"/>
+      </w:pPr>
+      <w:r>
+        <w:drawing>
+          <wp:anchor distT="0" distB="0" distL="114300" distR="114300" simplePos="0" relativeHeight="251670528" behindDoc="0" locked="0" layoutInCell="1" allowOverlap="1" wp14:anchorId="32478AD0" wp14:editId="192F524F">
+            <wp:simplePos x="0" y="0"/>
+            <wp:positionH relativeFrom="margin">
+              <wp:align>right</wp:align>
+            </wp:positionH>
+            <wp:positionV relativeFrom="paragraph">
+              <wp:posOffset>13739</wp:posOffset>
+            </wp:positionV>
+            <wp:extent cx="5612130" cy="3479165"/>
+            <wp:effectExtent l="0" t="0" r="7620" b="6985"/>
+            <wp:wrapNone/>
+            <wp:docPr id="1024364551" name="Imagen 3"/>
+            <wp:cNvGraphicFramePr>
+              <a:graphicFrameLocks xmlns:a="http://schemas.openxmlformats.org/drawingml/2006/main" noChangeAspect="1"/>
+            </wp:cNvGraphicFramePr>
+            <a:graphic xmlns:a="http://schemas.openxmlformats.org/drawingml/2006/main">
+              <a:graphicData uri="http://schemas.openxmlformats.org/drawingml/2006/picture">
+                <pic:pic xmlns:pic="http://schemas.openxmlformats.org/drawingml/2006/picture">
+                  <pic:nvPicPr>
+                    <pic:cNvPr id="0" name="Picture 11"/>
+                    <pic:cNvPicPr>
+                      <a:picLocks noChangeAspect="1" noChangeArrowheads="1"/>
+                    </pic:cNvPicPr>
+                  </pic:nvPicPr>
+                  <pic:blipFill>
+                    <a:blip r:embed="rId18" cstate="print">
+                      <a:extLst>
+                        <a:ext uri="{28A0092B-C50C-407E-A947-70E740481C1C}">
+                          <a14:useLocalDpi xmlns:a14="http://schemas.microsoft.com/office/drawing/2010/main" val="0"/>
+                        </a:ext>
+                      </a:extLst>
+                    </a:blip>
+                    <a:srcRect/>
+                    <a:stretch>
+                      <a:fillRect/>
+                    </a:stretch>
+                  </pic:blipFill>
+                  <pic:spPr bwMode="auto">
+                    <a:xfrm>
+                      <a:off x="0" y="0"/>
+                      <a:ext cx="5612130" cy="3479165"/>
+                    </a:xfrm>
+                    <a:prstGeom prst="rect">
+                      <a:avLst/>
+                    </a:prstGeom>
+                    <a:noFill/>
+                    <a:ln>
+                      <a:noFill/>
+                    </a:ln>
+                  </pic:spPr>
+                </pic:pic>
+              </a:graphicData>
+            </a:graphic>
+            <wp14:sizeRelH relativeFrom="page">
+              <wp14:pctWidth>0</wp14:pctWidth>
+            </wp14:sizeRelH>
+            <wp14:sizeRelV relativeFrom="page">
+              <wp14:pctHeight>0</wp14:pctHeight>
+            </wp14:sizeRelV>
+          </wp:anchor>
+        </w:drawing>
+      </w:r>
+    </w:p>
+    <w:p>
+      <w:pPr>
+        <w:ind w:firstLine="708"/>
+      </w:pPr>
+    </w:p>
+    <w:p>
+      <w:pPr>
+        <w:ind w:firstLine="708"/>
+      </w:pPr>
+    </w:p>
+    <w:p>
+      <w:pPr>
+        <w:ind w:firstLine="708"/>
+      </w:pPr>
+    </w:p>
+    <w:p>
+      <w:pPr>
+        <w:ind w:firstLine="708"/>
+      </w:pPr>
+    </w:p>
+    <w:p/>
+    <w:p/>
+    <w:p/>
+    <w:p/>
+    <w:p/>
+    <w:p/>
+    <w:p/>
+    <w:p/>
+    <w:p/>
+    <w:p/>
+    <w:p/>
+    <w:p/>
+    <w:p/>
+    <w:p/>
+    <w:p/>
+    <w:p/>
+    <w:p/>
+    <w:p/>
+    <w:p/>
+    <w:p/>
+    <w:p>
+      <w:pPr>
+        <w:pStyle w:val="Prrafodelista"/>
+        <w:numPr>
+          <w:ilvl w:val="0"/>
+          <w:numId w:val="8"/>
+        </w:numPr>
+      </w:pPr>
+      <w:r>
+        <w:lastRenderedPageBreak/>
+        <w:t>Pruebas realizadas en Postman</w:t>
+      </w:r>
+    </w:p>
+    <w:p>
+      <w:pPr>
+        <w:pStyle w:val="Prrafodelista"/>
+        <w:numPr>
+          <w:ilvl w:val="0"/>
+          <w:numId w:val="5"/>
+        </w:numPr>
+      </w:pPr>
+      <w:r>
+        <w:t xml:space="preserve">POST - </w:t>
+      </w:r>
+      <w:hyperlink r:id="rId19" w:history="1">
+        <w:r>
+          <w:rPr>
+            <w:rStyle w:val="Hipervnculo"/>
+          </w:rPr>
+          <w:t>http://localhost:8080/api/mesas</w:t>
+        </w:r>
+      </w:hyperlink>
+    </w:p>
+    <w:p>
+      <w:pPr>
+        <w:ind w:left="360"/>
+      </w:pPr>
+      <w:r>
+        <w:drawing>
+          <wp:anchor distT="0" distB="0" distL="114300" distR="114300" simplePos="0" relativeHeight="251671552" behindDoc="0" locked="0" layoutInCell="1" allowOverlap="1" wp14:anchorId="7483A382" wp14:editId="1B18ECAE">
+            <wp:simplePos x="0" y="0"/>
+            <wp:positionH relativeFrom="margin">
+              <wp:align>right</wp:align>
+            </wp:positionH>
+            <wp:positionV relativeFrom="paragraph">
+              <wp:posOffset>52878</wp:posOffset>
+            </wp:positionV>
+            <wp:extent cx="5624557" cy="2549236"/>
+            <wp:effectExtent l="0" t="0" r="0" b="3810"/>
+            <wp:wrapNone/>
+            <wp:docPr id="1930518750" name="Imagen 1"/>
+            <wp:cNvGraphicFramePr>
+              <a:graphicFrameLocks xmlns:a="http://schemas.openxmlformats.org/drawingml/2006/main" noChangeAspect="1"/>
+            </wp:cNvGraphicFramePr>
+            <a:graphic xmlns:a="http://schemas.openxmlformats.org/drawingml/2006/main">
+              <a:graphicData uri="http://schemas.openxmlformats.org/drawingml/2006/picture">
+                <pic:pic xmlns:pic="http://schemas.openxmlformats.org/drawingml/2006/picture">
+                  <pic:nvPicPr>
+                    <pic:cNvPr id="1930518750" name=""/>
+                    <pic:cNvPicPr/>
+                  </pic:nvPicPr>
+                  <pic:blipFill>
+                    <a:blip r:embed="rId20">
+                      <a:extLst>
+                        <a:ext uri="{28A0092B-C50C-407E-A947-70E740481C1C}">
+                          <a14:useLocalDpi xmlns:a14="http://schemas.microsoft.com/office/drawing/2010/main" val="0"/>
+                        </a:ext>
+                      </a:extLst>
+                    </a:blip>
+                    <a:stretch>
+                      <a:fillRect/>
+                    </a:stretch>
+                  </pic:blipFill>
+                  <pic:spPr>
+                    <a:xfrm>
+                      <a:off x="0" y="0"/>
+                      <a:ext cx="5627704" cy="2550662"/>
+                    </a:xfrm>
+                    <a:prstGeom prst="rect">
+                      <a:avLst/>
+                    </a:prstGeom>
+                  </pic:spPr>
+                </pic:pic>
+              </a:graphicData>
+            </a:graphic>
+            <wp14:sizeRelH relativeFrom="page">
+              <wp14:pctWidth>0</wp14:pctWidth>
+            </wp14:sizeRelH>
+            <wp14:sizeRelV relativeFrom="page">
+              <wp14:pctHeight>0</wp14:pctHeight>
+            </wp14:sizeRelV>
+          </wp:anchor>
+        </w:drawing>
+      </w:r>
+    </w:p>
+    <w:p/>
+    <w:p/>
+    <w:p/>
+    <w:p/>
+    <w:p/>
+    <w:p/>
+    <w:p/>
+    <w:p/>
+    <w:p>
+      <w:pPr>
+        <w:pStyle w:val="Prrafodelista"/>
+        <w:numPr>
+          <w:ilvl w:val="0"/>
+          <w:numId w:val="5"/>
+        </w:numPr>
+        <w:tabs>
+          <w:tab w:val="left" w:pos="1004"/>
+        </w:tabs>
+      </w:pPr>
+      <w:r>
+        <w:t>GET</w:t>
+      </w:r>
+      <w:r>
+        <w:t xml:space="preserve"> - </w:t>
+      </w:r>
+      <w:hyperlink r:id="rId21" w:history="1">
+        <w:r>
+          <w:rPr>
+            <w:rStyle w:val="Hipervnculo"/>
+          </w:rPr>
+          <w:t>http://localhost:8080/api/mesas</w:t>
+        </w:r>
+      </w:hyperlink>
+    </w:p>
+    <w:p>
+      <w:pPr>
+        <w:pStyle w:val="Prrafodelista"/>
+        <w:tabs>
+          <w:tab w:val="left" w:pos="1004"/>
+        </w:tabs>
+      </w:pPr>
+      <w:r>
+        <w:rPr>
+          <w:noProof/>
+        </w:rPr>
+        <w:drawing>
+          <wp:anchor distT="0" distB="0" distL="114300" distR="114300" simplePos="0" relativeHeight="251672576" behindDoc="0" locked="0" layoutInCell="1" allowOverlap="1" wp14:anchorId="4B711735" wp14:editId="6D0A2746">
+            <wp:simplePos x="0" y="0"/>
+            <wp:positionH relativeFrom="margin">
+              <wp:posOffset>-8717</wp:posOffset>
+            </wp:positionH>
+            <wp:positionV relativeFrom="paragraph">
+              <wp:posOffset>225655</wp:posOffset>
+            </wp:positionV>
+            <wp:extent cx="5615125" cy="3786909"/>
+            <wp:effectExtent l="0" t="0" r="5080" b="4445"/>
+            <wp:wrapNone/>
+            <wp:docPr id="1587138548" name="Imagen 6"/>
+            <wp:cNvGraphicFramePr>
+              <a:graphicFrameLocks xmlns:a="http://schemas.openxmlformats.org/drawingml/2006/main" noChangeAspect="1"/>
+            </wp:cNvGraphicFramePr>
+            <a:graphic xmlns:a="http://schemas.openxmlformats.org/drawingml/2006/main">
+              <a:graphicData uri="http://schemas.openxmlformats.org/drawingml/2006/picture">
+                <pic:pic xmlns:pic="http://schemas.openxmlformats.org/drawingml/2006/picture">
+                  <pic:nvPicPr>
+                    <pic:cNvPr id="0" name="Picture 4"/>
+                    <pic:cNvPicPr>
+                      <a:picLocks noChangeAspect="1" noChangeArrowheads="1"/>
+                    </pic:cNvPicPr>
+                  </pic:nvPicPr>
+                  <pic:blipFill>
+                    <a:blip r:embed="rId22">
+                      <a:extLst>
+                        <a:ext uri="{28A0092B-C50C-407E-A947-70E740481C1C}">
+                          <a14:useLocalDpi xmlns:a14="http://schemas.microsoft.com/office/drawing/2010/main" val="0"/>
+                        </a:ext>
+                      </a:extLst>
+                    </a:blip>
+                    <a:srcRect/>
+                    <a:stretch>
+                      <a:fillRect/>
+                    </a:stretch>
+                  </pic:blipFill>
+                  <pic:spPr bwMode="auto">
+                    <a:xfrm>
+                      <a:off x="0" y="0"/>
+                      <a:ext cx="5617102" cy="3788242"/>
+                    </a:xfrm>
+                    <a:prstGeom prst="rect">
+                      <a:avLst/>
+                    </a:prstGeom>
+                    <a:noFill/>
+                  </pic:spPr>
+                </pic:pic>
+              </a:graphicData>
+            </a:graphic>
+            <wp14:sizeRelH relativeFrom="page">
+              <wp14:pctWidth>0</wp14:pctWidth>
+            </wp14:sizeRelH>
+            <wp14:sizeRelV relativeFrom="page">
+              <wp14:pctHeight>0</wp14:pctHeight>
+            </wp14:sizeRelV>
+          </wp:anchor>
+        </w:drawing>
+      </w:r>
+    </w:p>
+    <w:p>
+      <w:pPr>
+        <w:tabs>
+          <w:tab w:val="left" w:pos="1004"/>
+        </w:tabs>
+        <w:ind w:left="360"/>
+      </w:pPr>
+    </w:p>
+    <w:p>
+      <w:pPr>
+        <w:tabs>
+          <w:tab w:val="left" w:pos="1004"/>
+        </w:tabs>
+      </w:pPr>
+    </w:p>
+    <w:p/>
+    <w:p/>
+    <w:p/>
+    <w:p/>
+    <w:p/>
+    <w:p/>
+    <w:p/>
+    <w:p/>
+    <w:p/>
+    <w:p/>
+    <w:p/>
+    <w:p/>
+    <w:p>
+      <w:pPr>
+        <w:pStyle w:val="Prrafodelista"/>
+        <w:numPr>
+          <w:ilvl w:val="0"/>
+          <w:numId w:val="8"/>
+        </w:numPr>
+      </w:pPr>
+      <w:r>
+        <w:lastRenderedPageBreak/>
+        <w:t>Pruebas realizadas en Postman</w:t>
+      </w:r>
+    </w:p>
+    <w:p>
+      <w:pPr>
+        <w:pStyle w:val="Prrafodelista"/>
+        <w:numPr>
+          <w:ilvl w:val="0"/>
+          <w:numId w:val="5"/>
+        </w:numPr>
+      </w:pPr>
+      <w:r>
+        <w:t xml:space="preserve">POST - </w:t>
+      </w:r>
+      <w:r>
+        <w:t xml:space="preserve"> </w:t>
+      </w:r>
+      <w:hyperlink r:id="rId23" w:history="1">
+        <w:r>
+          <w:rPr>
+            <w:rStyle w:val="Hipervnculo"/>
+          </w:rPr>
+          <w:t>http://localhost:8080/api/</w:t>
+        </w:r>
+        <w:r>
+          <w:rPr>
+            <w:rStyle w:val="Hipervnculo"/>
+          </w:rPr>
+          <w:t>reservas</w:t>
+        </w:r>
+      </w:hyperlink>
+    </w:p>
+    <w:p>
+      <w:r>
+        <w:drawing>
+          <wp:anchor distT="0" distB="0" distL="114300" distR="114300" simplePos="0" relativeHeight="251673600" behindDoc="0" locked="0" layoutInCell="1" allowOverlap="1" wp14:anchorId="626C8940" wp14:editId="1F9CA51B">
+            <wp:simplePos x="0" y="0"/>
+            <wp:positionH relativeFrom="margin">
+              <wp:align>right</wp:align>
+            </wp:positionH>
+            <wp:positionV relativeFrom="paragraph">
+              <wp:posOffset>167005</wp:posOffset>
+            </wp:positionV>
+            <wp:extent cx="5612130" cy="2962275"/>
+            <wp:effectExtent l="0" t="0" r="7620" b="9525"/>
+            <wp:wrapNone/>
+            <wp:docPr id="2134500941" name="Imagen 1"/>
+            <wp:cNvGraphicFramePr>
+              <a:graphicFrameLocks xmlns:a="http://schemas.openxmlformats.org/drawingml/2006/main" noChangeAspect="1"/>
+            </wp:cNvGraphicFramePr>
+            <a:graphic xmlns:a="http://schemas.openxmlformats.org/drawingml/2006/main">
+              <a:graphicData uri="http://schemas.openxmlformats.org/drawingml/2006/picture">
+                <pic:pic xmlns:pic="http://schemas.openxmlformats.org/drawingml/2006/picture">
+                  <pic:nvPicPr>
+                    <pic:cNvPr id="2134500941" name=""/>
+                    <pic:cNvPicPr/>
+                  </pic:nvPicPr>
+                  <pic:blipFill>
+                    <a:blip r:embed="rId24">
+                      <a:extLst>
+                        <a:ext uri="{28A0092B-C50C-407E-A947-70E740481C1C}">
+                          <a14:useLocalDpi xmlns:a14="http://schemas.microsoft.com/office/drawing/2010/main" val="0"/>
+                        </a:ext>
+                      </a:extLst>
+                    </a:blip>
+                    <a:stretch>
+                      <a:fillRect/>
+                    </a:stretch>
+                  </pic:blipFill>
+                  <pic:spPr>
+                    <a:xfrm>
+                      <a:off x="0" y="0"/>
+                      <a:ext cx="5612130" cy="2962275"/>
+                    </a:xfrm>
+                    <a:prstGeom prst="rect">
+                      <a:avLst/>
+                    </a:prstGeom>
+                  </pic:spPr>
+                </pic:pic>
+              </a:graphicData>
+            </a:graphic>
+            <wp14:sizeRelH relativeFrom="page">
+              <wp14:pctWidth>0</wp14:pctWidth>
+            </wp14:sizeRelH>
+            <wp14:sizeRelV relativeFrom="page">
+              <wp14:pctHeight>0</wp14:pctHeight>
+            </wp14:sizeRelV>
+          </wp:anchor>
+        </w:drawing>
+      </w:r>
+    </w:p>
+    <w:p/>
+    <w:p/>
+    <w:p/>
+    <w:p/>
+    <w:p/>
+    <w:p/>
+    <w:p/>
+    <w:p/>
+    <w:p>
+      <w:pPr>
+        <w:tabs>
+          <w:tab w:val="left" w:pos="1396"/>
+        </w:tabs>
+      </w:pPr>
+    </w:p>
+    <w:p>
+      <w:pPr>
+        <w:tabs>
+          <w:tab w:val="left" w:pos="1396"/>
+        </w:tabs>
+      </w:pPr>
+      <w:r>
+        <w:tab/>
+      </w:r>
+      <w:r>
+        <w:tab/>
+      </w:r>
+      <w:r>
+        <w:tab/>
+      </w:r>
+      <w:r>
+        <w:tab/>
+      </w:r>
+      <w:r>
+        <w:tab/>
+      </w:r>
+      <w:r>
+        <w:tab/>
+      </w:r>
+      <w:r>
+        <w:tab/>
+      </w:r>
+      <w:r>
+        <w:tab/>
+      </w:r>
+      <w:r>
+        <w:tab/>
+      </w:r>
+    </w:p>
+    <w:p>
+      <w:pPr>
+        <w:pStyle w:val="Prrafodelista"/>
+        <w:numPr>
+          <w:ilvl w:val="0"/>
+          <w:numId w:val="5"/>
+        </w:numPr>
+        <w:tabs>
+          <w:tab w:val="left" w:pos="1396"/>
+        </w:tabs>
+      </w:pPr>
+      <w:r>
+        <w:t xml:space="preserve">GET - </w:t>
+      </w:r>
+      <w:hyperlink r:id="rId25" w:history="1">
+        <w:r>
+          <w:rPr>
+            <w:rStyle w:val="Hipervnculo"/>
+          </w:rPr>
+          <w:t>http://localhost:8080/api/reservas</w:t>
+        </w:r>
+      </w:hyperlink>
+      <w:r>
+        <w:t xml:space="preserve"> </w:t>
+      </w:r>
+      <w:r>
+        <w:tab/>
+      </w:r>
+    </w:p>
+    <w:p>
+      <w:pPr>
+        <w:tabs>
+          <w:tab w:val="left" w:pos="1396"/>
+        </w:tabs>
+      </w:pPr>
+      <w:r>
+        <w:rPr>
+          <w:noProof/>
+        </w:rPr>
+        <w:drawing>
+          <wp:anchor distT="0" distB="0" distL="114300" distR="114300" simplePos="0" relativeHeight="251674624" behindDoc="0" locked="0" layoutInCell="1" allowOverlap="1" wp14:anchorId="6319DE66" wp14:editId="1B452F82">
+            <wp:simplePos x="0" y="0"/>
+            <wp:positionH relativeFrom="margin">
+              <wp:align>right</wp:align>
+            </wp:positionH>
+            <wp:positionV relativeFrom="paragraph">
+              <wp:posOffset>99695</wp:posOffset>
+            </wp:positionV>
+            <wp:extent cx="5612130" cy="3599180"/>
+            <wp:effectExtent l="0" t="0" r="7620" b="1270"/>
+            <wp:wrapNone/>
+            <wp:docPr id="2037550003" name="Imagen 7"/>
+            <wp:cNvGraphicFramePr>
+              <a:graphicFrameLocks xmlns:a="http://schemas.openxmlformats.org/drawingml/2006/main" noChangeAspect="1"/>
+            </wp:cNvGraphicFramePr>
+            <a:graphic xmlns:a="http://schemas.openxmlformats.org/drawingml/2006/main">
+              <a:graphicData uri="http://schemas.openxmlformats.org/drawingml/2006/picture">
+                <pic:pic xmlns:pic="http://schemas.openxmlformats.org/drawingml/2006/picture">
+                  <pic:nvPicPr>
+                    <pic:cNvPr id="0" name="Picture 5"/>
+                    <pic:cNvPicPr>
+                      <a:picLocks noChangeAspect="1" noChangeArrowheads="1"/>
+                    </pic:cNvPicPr>
+                  </pic:nvPicPr>
+                  <pic:blipFill>
+                    <a:blip r:embed="rId26">
+                      <a:extLst>
+                        <a:ext uri="{28A0092B-C50C-407E-A947-70E740481C1C}">
+                          <a14:useLocalDpi xmlns:a14="http://schemas.microsoft.com/office/drawing/2010/main" val="0"/>
+                        </a:ext>
+                      </a:extLst>
+                    </a:blip>
+                    <a:srcRect/>
+                    <a:stretch>
+                      <a:fillRect/>
+                    </a:stretch>
+                  </pic:blipFill>
+                  <pic:spPr bwMode="auto">
+                    <a:xfrm>
+                      <a:off x="0" y="0"/>
+                      <a:ext cx="5612130" cy="3599180"/>
+                    </a:xfrm>
+                    <a:prstGeom prst="rect">
+                      <a:avLst/>
+                    </a:prstGeom>
+                    <a:noFill/>
+                  </pic:spPr>
+                </pic:pic>
+              </a:graphicData>
+            </a:graphic>
+            <wp14:sizeRelH relativeFrom="page">
+              <wp14:pctWidth>0</wp14:pctWidth>
+            </wp14:sizeRelH>
+            <wp14:sizeRelV relativeFrom="page">
+              <wp14:pctHeight>0</wp14:pctHeight>
+            </wp14:sizeRelV>
+          </wp:anchor>
+        </w:drawing>
+      </w:r>
+    </w:p>
+    <w:p>
+      <w:pPr>
+        <w:tabs>
+          <w:tab w:val="left" w:pos="1396"/>
+        </w:tabs>
+      </w:pPr>
+    </w:p>
+    <w:p>
+      <w:pPr>
+        <w:tabs>
+          <w:tab w:val="left" w:pos="1396"/>
+        </w:tabs>
+      </w:pPr>
+    </w:p>
+    <w:p>
+      <w:pPr>
+        <w:tabs>
+          <w:tab w:val="left" w:pos="1396"/>
+        </w:tabs>
+      </w:pPr>
+    </w:p>
+    <w:p>
+      <w:pPr>
+        <w:tabs>
+          <w:tab w:val="left" w:pos="1396"/>
+        </w:tabs>
+      </w:pPr>
+    </w:p>
+    <w:p>
+      <w:pPr>
+        <w:tabs>
+          <w:tab w:val="left" w:pos="1396"/>
+        </w:tabs>
+      </w:pPr>
+    </w:p>
+    <w:p>
+      <w:pPr>
+        <w:tabs>
+          <w:tab w:val="left" w:pos="1396"/>
+        </w:tabs>
+      </w:pPr>
+    </w:p>
+    <w:p>
+      <w:pPr>
+        <w:tabs>
+          <w:tab w:val="left" w:pos="1396"/>
+        </w:tabs>
+      </w:pPr>
+    </w:p>
+    <w:p>
+      <w:pPr>
+        <w:tabs>
+          <w:tab w:val="left" w:pos="1396"/>
+        </w:tabs>
+      </w:pPr>
+    </w:p>
+    <w:p>
+      <w:pPr>
+        <w:tabs>
+          <w:tab w:val="left" w:pos="1396"/>
+        </w:tabs>
+      </w:pPr>
+    </w:p>
+    <w:p>
+      <w:pPr>
+        <w:tabs>
+          <w:tab w:val="left" w:pos="1396"/>
+        </w:tabs>
+      </w:pPr>
+    </w:p>
+    <w:p>
+      <w:pPr>
+        <w:tabs>
+          <w:tab w:val="left" w:pos="1396"/>
+        </w:tabs>
+      </w:pPr>
+    </w:p>
+    <w:p>
+      <w:pPr>
+        <w:pStyle w:val="Prrafodelista"/>
+        <w:numPr>
+          <w:ilvl w:val="0"/>
+          <w:numId w:val="8"/>
+        </w:numPr>
+        <w:tabs>
+          <w:tab w:val="left" w:pos="1396"/>
+        </w:tabs>
+      </w:pPr>
+      <w:r>
+        <w:lastRenderedPageBreak/>
+        <w:t xml:space="preserve">Duplicidad en </w:t>
+      </w:r>
+      <w:r>
+        <w:t>M</w:t>
+      </w:r>
+      <w:r>
+        <w:t>esas y</w:t>
+      </w:r>
+      <w:r>
+        <w:t xml:space="preserve"> R</w:t>
+      </w:r>
+      <w:r>
+        <w:t>eservas</w:t>
+      </w:r>
+      <w:r>
+        <w:tab/>
+      </w:r>
+      <w:r>
+        <w:tab/>
+      </w:r>
+      <w:r>
+        <w:tab/>
+      </w:r>
+      <w:r>
+        <w:tab/>
+      </w:r>
+      <w:r>
+        <w:tab/>
+      </w:r>
+      <w:r>
+        <w:tab/>
+      </w:r>
+      <w:r>
+        <w:tab/>
+      </w:r>
+    </w:p>
+    <w:p>
+      <w:pPr>
+        <w:tabs>
+          <w:tab w:val="left" w:pos="1396"/>
+        </w:tabs>
+      </w:pPr>
+      <w:r>
+        <w:rPr>
+          <w:noProof/>
+        </w:rPr>
+        <w:drawing>
+          <wp:anchor distT="0" distB="0" distL="114300" distR="114300" simplePos="0" relativeHeight="251675648" behindDoc="0" locked="0" layoutInCell="1" allowOverlap="1" wp14:anchorId="0838BEA1" wp14:editId="15946AE7">
+            <wp:simplePos x="0" y="0"/>
+            <wp:positionH relativeFrom="margin">
+              <wp:align>right</wp:align>
+            </wp:positionH>
+            <wp:positionV relativeFrom="paragraph">
+              <wp:posOffset>194243</wp:posOffset>
+            </wp:positionV>
+            <wp:extent cx="5606415" cy="2477770"/>
+            <wp:effectExtent l="0" t="0" r="0" b="0"/>
+            <wp:wrapNone/>
+            <wp:docPr id="1523320800" name="Imagen 8"/>
+            <wp:cNvGraphicFramePr>
+              <a:graphicFrameLocks xmlns:a="http://schemas.openxmlformats.org/drawingml/2006/main" noChangeAspect="1"/>
+            </wp:cNvGraphicFramePr>
+            <a:graphic xmlns:a="http://schemas.openxmlformats.org/drawingml/2006/main">
+              <a:graphicData uri="http://schemas.openxmlformats.org/drawingml/2006/picture">
+                <pic:pic xmlns:pic="http://schemas.openxmlformats.org/drawingml/2006/picture">
+                  <pic:nvPicPr>
+                    <pic:cNvPr id="0" name="Picture 6"/>
+                    <pic:cNvPicPr>
+                      <a:picLocks noChangeAspect="1" noChangeArrowheads="1"/>
+                    </pic:cNvPicPr>
+                  </pic:nvPicPr>
+                  <pic:blipFill rotWithShape="1">
+                    <a:blip r:embed="rId27">
+                      <a:extLst>
+                        <a:ext uri="{28A0092B-C50C-407E-A947-70E740481C1C}">
+                          <a14:useLocalDpi xmlns:a14="http://schemas.microsoft.com/office/drawing/2010/main" val="0"/>
+                        </a:ext>
+                      </a:extLst>
+                    </a:blip>
+                    <a:srcRect b="15477"/>
+                    <a:stretch>
+                      <a:fillRect/>
+                    </a:stretch>
+                  </pic:blipFill>
+                  <pic:spPr bwMode="auto">
+                    <a:xfrm>
+                      <a:off x="0" y="0"/>
+                      <a:ext cx="5606415" cy="2477770"/>
+                    </a:xfrm>
+                    <a:prstGeom prst="rect">
+                      <a:avLst/>
+                    </a:prstGeom>
+                    <a:noFill/>
+                    <a:ln>
+                      <a:noFill/>
+                    </a:ln>
+                    <a:extLst>
+                      <a:ext uri="{53640926-AAD7-44D8-BBD7-CCE9431645EC}">
+                        <a14:shadowObscured xmlns:a14="http://schemas.microsoft.com/office/drawing/2010/main"/>
+                      </a:ext>
+                    </a:extLst>
+                  </pic:spPr>
+                </pic:pic>
+              </a:graphicData>
+            </a:graphic>
+            <wp14:sizeRelH relativeFrom="page">
+              <wp14:pctWidth>0</wp14:pctWidth>
+            </wp14:sizeRelH>
+            <wp14:sizeRelV relativeFrom="page">
+              <wp14:pctHeight>0</wp14:pctHeight>
+            </wp14:sizeRelV>
+          </wp:anchor>
+        </w:drawing>
+      </w:r>
+    </w:p>
+    <w:p>
+      <w:pPr>
+        <w:tabs>
+          <w:tab w:val="left" w:pos="1396"/>
+        </w:tabs>
+      </w:pPr>
+    </w:p>
+    <w:p>
+      <w:pPr>
+        <w:tabs>
+          <w:tab w:val="left" w:pos="1396"/>
+        </w:tabs>
+      </w:pPr>
+    </w:p>
+    <w:p>
+      <w:pPr>
+        <w:tabs>
+          <w:tab w:val="left" w:pos="1396"/>
+        </w:tabs>
+      </w:pPr>
+    </w:p>
+    <w:p>
+      <w:pPr>
+        <w:tabs>
+          <w:tab w:val="left" w:pos="1396"/>
+        </w:tabs>
+      </w:pPr>
+    </w:p>
+    <w:p>
+      <w:pPr>
+        <w:tabs>
+          <w:tab w:val="left" w:pos="1396"/>
+        </w:tabs>
+      </w:pPr>
+    </w:p>
+    <w:p>
+      <w:pPr>
+        <w:tabs>
+          <w:tab w:val="left" w:pos="1396"/>
+        </w:tabs>
+      </w:pPr>
+    </w:p>
+    <w:p>
+      <w:pPr>
+        <w:tabs>
+          <w:tab w:val="left" w:pos="1396"/>
+        </w:tabs>
+      </w:pPr>
+    </w:p>
+    <w:p>
+      <w:pPr>
+        <w:tabs>
+          <w:tab w:val="left" w:pos="1396"/>
+        </w:tabs>
+      </w:pPr>
+    </w:p>
+    <w:p>
+      <w:pPr>
+        <w:tabs>
+          <w:tab w:val="left" w:pos="1396"/>
+        </w:tabs>
+      </w:pPr>
+      <w:r>
+        <w:rPr>
+          <w:noProof/>
+        </w:rPr>
+        <w:drawing>
+          <wp:anchor distT="0" distB="0" distL="114300" distR="114300" simplePos="0" relativeHeight="251676672" behindDoc="0" locked="0" layoutInCell="1" allowOverlap="1" wp14:anchorId="62AD0D31" wp14:editId="414B4E54">
+            <wp:simplePos x="0" y="0"/>
+            <wp:positionH relativeFrom="margin">
+              <wp:align>right</wp:align>
+            </wp:positionH>
+            <wp:positionV relativeFrom="paragraph">
+              <wp:posOffset>113631</wp:posOffset>
+            </wp:positionV>
+            <wp:extent cx="5606415" cy="2646948"/>
+            <wp:effectExtent l="0" t="0" r="0" b="1270"/>
+            <wp:wrapNone/>
+            <wp:docPr id="6146903" name="Imagen 10"/>
+            <wp:cNvGraphicFramePr>
+              <a:graphicFrameLocks xmlns:a="http://schemas.openxmlformats.org/drawingml/2006/main" noChangeAspect="1"/>
+            </wp:cNvGraphicFramePr>
+            <a:graphic xmlns:a="http://schemas.openxmlformats.org/drawingml/2006/main">
+              <a:graphicData uri="http://schemas.openxmlformats.org/drawingml/2006/picture">
+                <pic:pic xmlns:pic="http://schemas.openxmlformats.org/drawingml/2006/picture">
+                  <pic:nvPicPr>
+                    <pic:cNvPr id="0" name="Picture 8"/>
+                    <pic:cNvPicPr>
+                      <a:picLocks noChangeAspect="1" noChangeArrowheads="1"/>
+                    </pic:cNvPicPr>
+                  </pic:nvPicPr>
+                  <pic:blipFill>
+                    <a:blip r:embed="rId28">
+                      <a:extLst>
+                        <a:ext uri="{28A0092B-C50C-407E-A947-70E740481C1C}">
+                          <a14:useLocalDpi xmlns:a14="http://schemas.microsoft.com/office/drawing/2010/main" val="0"/>
+                        </a:ext>
+                      </a:extLst>
+                    </a:blip>
+                    <a:srcRect/>
+                    <a:stretch>
+                      <a:fillRect/>
+                    </a:stretch>
+                  </pic:blipFill>
+                  <pic:spPr bwMode="auto">
+                    <a:xfrm>
+                      <a:off x="0" y="0"/>
+                      <a:ext cx="5606415" cy="2646948"/>
+                    </a:xfrm>
+                    <a:prstGeom prst="rect">
+                      <a:avLst/>
+                    </a:prstGeom>
+                    <a:noFill/>
+                  </pic:spPr>
+                </pic:pic>
+              </a:graphicData>
+            </a:graphic>
+            <wp14:sizeRelH relativeFrom="page">
+              <wp14:pctWidth>0</wp14:pctWidth>
+            </wp14:sizeRelH>
+            <wp14:sizeRelV relativeFrom="page">
+              <wp14:pctHeight>0</wp14:pctHeight>
+            </wp14:sizeRelV>
+          </wp:anchor>
+        </w:drawing>
+      </w:r>
+    </w:p>
+    <w:p>
+      <w:pPr>
+        <w:tabs>
+          <w:tab w:val="left" w:pos="1396"/>
+        </w:tabs>
+      </w:pPr>
+    </w:p>
+    <w:p>
+      <w:pPr>
+        <w:tabs>
+          <w:tab w:val="left" w:pos="1396"/>
+        </w:tabs>
+      </w:pPr>
+    </w:p>
+    <w:p>
+      <w:pPr>
+        <w:tabs>
+          <w:tab w:val="left" w:pos="1396"/>
+        </w:tabs>
+      </w:pPr>
+    </w:p>
+    <w:p>
+      <w:pPr>
+        <w:tabs>
+          <w:tab w:val="left" w:pos="1396"/>
+        </w:tabs>
+      </w:pPr>
+    </w:p>
+    <w:p>
+      <w:pPr>
+        <w:tabs>
+          <w:tab w:val="left" w:pos="1396"/>
+        </w:tabs>
+      </w:pPr>
+    </w:p>
+    <w:p>
+      <w:pPr>
+        <w:tabs>
+          <w:tab w:val="left" w:pos="1396"/>
+        </w:tabs>
+      </w:pPr>
+    </w:p>
+    <w:p>
+      <w:pPr>
+        <w:tabs>
+          <w:tab w:val="left" w:pos="1396"/>
+        </w:tabs>
+      </w:pPr>
+    </w:p>
+    <w:p>
+      <w:pPr>
+        <w:tabs>
+          <w:tab w:val="left" w:pos="1396"/>
+        </w:tabs>
+      </w:pPr>
+    </w:p>
+    <w:p>
+      <w:pPr>
+        <w:tabs>
+          <w:tab w:val="left" w:pos="1396"/>
+        </w:tabs>
+      </w:pPr>
+    </w:p>
+    <w:p>
+      <w:pPr>
+        <w:tabs>
+          <w:tab w:val="left" w:pos="1396"/>
+        </w:tabs>
+      </w:pPr>
+    </w:p>
+    <w:p>
+      <w:pPr>
+        <w:tabs>
+          <w:tab w:val="left" w:pos="1396"/>
+        </w:tabs>
+      </w:pPr>
+    </w:p>
+    <w:p>
+      <w:pPr>
+        <w:tabs>
+          <w:tab w:val="left" w:pos="1396"/>
+        </w:tabs>
+      </w:pPr>
+    </w:p>
+    <w:p>
+      <w:pPr>
+        <w:tabs>
+          <w:tab w:val="left" w:pos="1396"/>
+        </w:tabs>
+      </w:pPr>
+    </w:p>
+    <w:p>
+      <w:pPr>
+        <w:tabs>
+          <w:tab w:val="left" w:pos="1396"/>
+        </w:tabs>
+      </w:pPr>
+    </w:p>
+    <w:p>
+      <w:pPr>
+        <w:tabs>
+          <w:tab w:val="left" w:pos="1396"/>
+        </w:tabs>
+      </w:pPr>
+    </w:p>
+    <w:p>
+      <w:pPr>
+        <w:pStyle w:val="Prrafodelista"/>
+        <w:numPr>
+          <w:ilvl w:val="0"/>
+          <w:numId w:val="8"/>
+        </w:numPr>
+        <w:tabs>
+          <w:tab w:val="left" w:pos="1396"/>
+        </w:tabs>
+      </w:pPr>
+      <w:r>
+        <w:lastRenderedPageBreak/>
+        <w:t>Verificación</w:t>
+      </w:r>
+      <w:r>
+        <w:t xml:space="preserve"> de pruebas con </w:t>
+      </w:r>
+      <w:r>
+        <w:t>PostgreSQL</w:t>
+      </w:r>
+    </w:p>
+    <w:p>
+      <w:pPr>
+        <w:tabs>
+          <w:tab w:val="left" w:pos="1396"/>
+        </w:tabs>
+      </w:pPr>
+      <w:r>
+        <w:rPr>
+          <w:noProof/>
+        </w:rPr>
+        <w:drawing>
+          <wp:anchor distT="0" distB="0" distL="114300" distR="114300" simplePos="0" relativeHeight="251678720" behindDoc="0" locked="0" layoutInCell="1" allowOverlap="1" wp14:anchorId="23248BC1" wp14:editId="766821F9">
+            <wp:simplePos x="0" y="0"/>
+            <wp:positionH relativeFrom="margin">
+              <wp:align>right</wp:align>
+            </wp:positionH>
+            <wp:positionV relativeFrom="paragraph">
+              <wp:posOffset>3499351</wp:posOffset>
+            </wp:positionV>
+            <wp:extent cx="5606716" cy="2826385"/>
+            <wp:effectExtent l="0" t="0" r="0" b="0"/>
+            <wp:wrapNone/>
+            <wp:docPr id="997707062" name="Imagen 11"/>
+            <wp:cNvGraphicFramePr>
+              <a:graphicFrameLocks xmlns:a="http://schemas.openxmlformats.org/drawingml/2006/main" noChangeAspect="1"/>
+            </wp:cNvGraphicFramePr>
+            <a:graphic xmlns:a="http://schemas.openxmlformats.org/drawingml/2006/main">
+              <a:graphicData uri="http://schemas.openxmlformats.org/drawingml/2006/picture">
+                <pic:pic xmlns:pic="http://schemas.openxmlformats.org/drawingml/2006/picture">
+                  <pic:nvPicPr>
+                    <pic:cNvPr id="0" name="Picture 9"/>
+                    <pic:cNvPicPr>
+                      <a:picLocks noChangeAspect="1" noChangeArrowheads="1"/>
+                    </pic:cNvPicPr>
+                  </pic:nvPicPr>
+                  <pic:blipFill>
+                    <a:blip r:embed="rId29">
+                      <a:extLst>
+                        <a:ext uri="{28A0092B-C50C-407E-A947-70E740481C1C}">
+                          <a14:useLocalDpi xmlns:a14="http://schemas.microsoft.com/office/drawing/2010/main" val="0"/>
+                        </a:ext>
+                      </a:extLst>
+                    </a:blip>
+                    <a:srcRect/>
+                    <a:stretch>
+                      <a:fillRect/>
+                    </a:stretch>
+                  </pic:blipFill>
+                  <pic:spPr bwMode="auto">
+                    <a:xfrm>
+                      <a:off x="0" y="0"/>
+                      <a:ext cx="5606716" cy="2826385"/>
+                    </a:xfrm>
+                    <a:prstGeom prst="rect">
+                      <a:avLst/>
+                    </a:prstGeom>
+                    <a:noFill/>
+                  </pic:spPr>
+                </pic:pic>
+              </a:graphicData>
+            </a:graphic>
+            <wp14:sizeRelH relativeFrom="page">
+              <wp14:pctWidth>0</wp14:pctWidth>
+            </wp14:sizeRelH>
+            <wp14:sizeRelV relativeFrom="page">
+              <wp14:pctHeight>0</wp14:pctHeight>
+            </wp14:sizeRelV>
+          </wp:anchor>
+        </w:drawing>
+      </w:r>
+      <w:r>
+        <w:drawing>
+          <wp:anchor distT="0" distB="0" distL="114300" distR="114300" simplePos="0" relativeHeight="251677696" behindDoc="0" locked="0" layoutInCell="1" allowOverlap="1" wp14:anchorId="5FC79FFD" wp14:editId="7ECC2CB4">
+            <wp:simplePos x="0" y="0"/>
+            <wp:positionH relativeFrom="margin">
+              <wp:align>center</wp:align>
+            </wp:positionH>
+            <wp:positionV relativeFrom="paragraph">
+              <wp:posOffset>82182</wp:posOffset>
+            </wp:positionV>
+            <wp:extent cx="4612005" cy="3224463"/>
+            <wp:effectExtent l="0" t="0" r="0" b="0"/>
+            <wp:wrapNone/>
+            <wp:docPr id="1429850270" name="Imagen 1"/>
+            <wp:cNvGraphicFramePr>
+              <a:graphicFrameLocks xmlns:a="http://schemas.openxmlformats.org/drawingml/2006/main" noChangeAspect="1"/>
+            </wp:cNvGraphicFramePr>
+            <a:graphic xmlns:a="http://schemas.openxmlformats.org/drawingml/2006/main">
+              <a:graphicData uri="http://schemas.openxmlformats.org/drawingml/2006/picture">
+                <pic:pic xmlns:pic="http://schemas.openxmlformats.org/drawingml/2006/picture">
+                  <pic:nvPicPr>
+                    <pic:cNvPr id="1429850270" name=""/>
+                    <pic:cNvPicPr/>
+                  </pic:nvPicPr>
+                  <pic:blipFill rotWithShape="1">
+                    <a:blip r:embed="rId30">
+                      <a:extLst>
+                        <a:ext uri="{28A0092B-C50C-407E-A947-70E740481C1C}">
+                          <a14:useLocalDpi xmlns:a14="http://schemas.microsoft.com/office/drawing/2010/main" val="0"/>
+                        </a:ext>
+                      </a:extLst>
+                    </a:blip>
+                    <a:srcRect r="17819" b="6450"/>
+                    <a:stretch>
+                      <a:fillRect/>
+                    </a:stretch>
+                  </pic:blipFill>
+                  <pic:spPr bwMode="auto">
+                    <a:xfrm>
+                      <a:off x="0" y="0"/>
+                      <a:ext cx="4612005" cy="3224463"/>
+                    </a:xfrm>
+                    <a:prstGeom prst="rect">
+                      <a:avLst/>
+                    </a:prstGeom>
+                    <a:ln>
+                      <a:noFill/>
+                    </a:ln>
+                    <a:extLst>
+                      <a:ext uri="{53640926-AAD7-44D8-BBD7-CCE9431645EC}">
+                        <a14:shadowObscured xmlns:a14="http://schemas.microsoft.com/office/drawing/2010/main"/>
+                      </a:ext>
+                    </a:extLst>
+                  </pic:spPr>
+                </pic:pic>
+              </a:graphicData>
+            </a:graphic>
+            <wp14:sizeRelH relativeFrom="page">
+              <wp14:pctWidth>0</wp14:pctWidth>
+            </wp14:sizeRelH>
+            <wp14:sizeRelV relativeFrom="page">
+              <wp14:pctHeight>0</wp14:pctHeight>
+            </wp14:sizeRelV>
+          </wp:anchor>
+        </w:drawing>
+      </w:r>
+    </w:p>
     <w:sectPr>
       <w:pgSz w:w="12240" w:h="15840"/>
       <w:pgMar w:top="1417" w:right="1701" w:bottom="1417" w:left="1701" w:header="708" w:footer="708" w:gutter="0"/>
@@ -1507,7 +3221,7 @@
   <w:abstractNum w:abstractNumId="0" w15:restartNumberingAfterBreak="0">
     <w:nsid w:val="04E452A8"/>
     <w:multiLevelType w:val="hybridMultilevel"/>
-    <w:tmpl w:val="DBD0679C"/>
+    <w:tmpl w:val="3006A170"/>
     <w:lvl w:ilvl="0" w:tplc="100A000B">
       <w:start w:val="1"/>
       <w:numFmt w:val="bullet"/>
@@ -1618,6 +3332,544 @@
     </w:lvl>
   </w:abstractNum>
   <w:abstractNum w:abstractNumId="1" w15:restartNumberingAfterBreak="0">
+    <w:nsid w:val="06855611"/>
+    <w:multiLevelType w:val="hybridMultilevel"/>
+    <w:tmpl w:val="BA305D3E"/>
+    <w:lvl w:ilvl="0" w:tplc="100A0001">
+      <w:start w:val="1"/>
+      <w:numFmt w:val="bullet"/>
+      <w:lvlText w:val=""/>
+      <w:lvlJc w:val="left"/>
+      <w:pPr>
+        <w:ind w:left="720" w:hanging="360"/>
+      </w:pPr>
+      <w:rPr>
+        <w:rFonts w:ascii="Symbol" w:hAnsi="Symbol" w:hint="default"/>
+      </w:rPr>
+    </w:lvl>
+    <w:lvl w:ilvl="1" w:tplc="FFFFFFFF" w:tentative="1">
+      <w:start w:val="1"/>
+      <w:numFmt w:val="bullet"/>
+      <w:lvlText w:val="o"/>
+      <w:lvlJc w:val="left"/>
+      <w:pPr>
+        <w:ind w:left="1440" w:hanging="360"/>
+      </w:pPr>
+      <w:rPr>
+        <w:rFonts w:ascii="Courier New" w:hAnsi="Courier New" w:cs="Courier New" w:hint="default"/>
+      </w:rPr>
+    </w:lvl>
+    <w:lvl w:ilvl="2" w:tplc="FFFFFFFF" w:tentative="1">
+      <w:start w:val="1"/>
+      <w:numFmt w:val="bullet"/>
+      <w:lvlText w:val=""/>
+      <w:lvlJc w:val="left"/>
+      <w:pPr>
+        <w:ind w:left="2160" w:hanging="360"/>
+      </w:pPr>
+      <w:rPr>
+        <w:rFonts w:ascii="Wingdings" w:hAnsi="Wingdings" w:hint="default"/>
+      </w:rPr>
+    </w:lvl>
+    <w:lvl w:ilvl="3" w:tplc="FFFFFFFF" w:tentative="1">
+      <w:start w:val="1"/>
+      <w:numFmt w:val="bullet"/>
+      <w:lvlText w:val=""/>
+      <w:lvlJc w:val="left"/>
+      <w:pPr>
+        <w:ind w:left="2880" w:hanging="360"/>
+      </w:pPr>
+      <w:rPr>
+        <w:rFonts w:ascii="Symbol" w:hAnsi="Symbol" w:hint="default"/>
+      </w:rPr>
+    </w:lvl>
+    <w:lvl w:ilvl="4" w:tplc="FFFFFFFF" w:tentative="1">
+      <w:start w:val="1"/>
+      <w:numFmt w:val="bullet"/>
+      <w:lvlText w:val="o"/>
+      <w:lvlJc w:val="left"/>
+      <w:pPr>
+        <w:ind w:left="3600" w:hanging="360"/>
+      </w:pPr>
+      <w:rPr>
+        <w:rFonts w:ascii="Courier New" w:hAnsi="Courier New" w:cs="Courier New" w:hint="default"/>
+      </w:rPr>
+    </w:lvl>
+    <w:lvl w:ilvl="5" w:tplc="FFFFFFFF" w:tentative="1">
+      <w:start w:val="1"/>
+      <w:numFmt w:val="bullet"/>
+      <w:lvlText w:val=""/>
+      <w:lvlJc w:val="left"/>
+      <w:pPr>
+        <w:ind w:left="4320" w:hanging="360"/>
+      </w:pPr>
+      <w:rPr>
+        <w:rFonts w:ascii="Wingdings" w:hAnsi="Wingdings" w:hint="default"/>
+      </w:rPr>
+    </w:lvl>
+    <w:lvl w:ilvl="6" w:tplc="FFFFFFFF" w:tentative="1">
+      <w:start w:val="1"/>
+      <w:numFmt w:val="bullet"/>
+      <w:lvlText w:val=""/>
+      <w:lvlJc w:val="left"/>
+      <w:pPr>
+        <w:ind w:left="5040" w:hanging="360"/>
+      </w:pPr>
+      <w:rPr>
+        <w:rFonts w:ascii="Symbol" w:hAnsi="Symbol" w:hint="default"/>
+      </w:rPr>
+    </w:lvl>
+    <w:lvl w:ilvl="7" w:tplc="FFFFFFFF" w:tentative="1">
+      <w:start w:val="1"/>
+      <w:numFmt w:val="bullet"/>
+      <w:lvlText w:val="o"/>
+      <w:lvlJc w:val="left"/>
+      <w:pPr>
+        <w:ind w:left="5760" w:hanging="360"/>
+      </w:pPr>
+      <w:rPr>
+        <w:rFonts w:ascii="Courier New" w:hAnsi="Courier New" w:cs="Courier New" w:hint="default"/>
+      </w:rPr>
+    </w:lvl>
+    <w:lvl w:ilvl="8" w:tplc="FFFFFFFF" w:tentative="1">
+      <w:start w:val="1"/>
+      <w:numFmt w:val="bullet"/>
+      <w:lvlText w:val=""/>
+      <w:lvlJc w:val="left"/>
+      <w:pPr>
+        <w:ind w:left="6480" w:hanging="360"/>
+      </w:pPr>
+      <w:rPr>
+        <w:rFonts w:ascii="Wingdings" w:hAnsi="Wingdings" w:hint="default"/>
+      </w:rPr>
+    </w:lvl>
+  </w:abstractNum>
+  <w:abstractNum w:abstractNumId="2" w15:restartNumberingAfterBreak="0">
+    <w:nsid w:val="26A71536"/>
+    <w:multiLevelType w:val="hybridMultilevel"/>
+    <w:tmpl w:val="D02A7842"/>
+    <w:lvl w:ilvl="0" w:tplc="100A000F">
+      <w:start w:val="1"/>
+      <w:numFmt w:val="decimal"/>
+      <w:lvlText w:val="%1."/>
+      <w:lvlJc w:val="left"/>
+      <w:pPr>
+        <w:ind w:left="720" w:hanging="360"/>
+      </w:pPr>
+    </w:lvl>
+    <w:lvl w:ilvl="1" w:tplc="100A0019" w:tentative="1">
+      <w:start w:val="1"/>
+      <w:numFmt w:val="lowerLetter"/>
+      <w:lvlText w:val="%2."/>
+      <w:lvlJc w:val="left"/>
+      <w:pPr>
+        <w:ind w:left="1440" w:hanging="360"/>
+      </w:pPr>
+    </w:lvl>
+    <w:lvl w:ilvl="2" w:tplc="100A001B" w:tentative="1">
+      <w:start w:val="1"/>
+      <w:numFmt w:val="lowerRoman"/>
+      <w:lvlText w:val="%3."/>
+      <w:lvlJc w:val="right"/>
+      <w:pPr>
+        <w:ind w:left="2160" w:hanging="180"/>
+      </w:pPr>
+    </w:lvl>
+    <w:lvl w:ilvl="3" w:tplc="100A000F" w:tentative="1">
+      <w:start w:val="1"/>
+      <w:numFmt w:val="decimal"/>
+      <w:lvlText w:val="%4."/>
+      <w:lvlJc w:val="left"/>
+      <w:pPr>
+        <w:ind w:left="2880" w:hanging="360"/>
+      </w:pPr>
+    </w:lvl>
+    <w:lvl w:ilvl="4" w:tplc="100A0019" w:tentative="1">
+      <w:start w:val="1"/>
+      <w:numFmt w:val="lowerLetter"/>
+      <w:lvlText w:val="%5."/>
+      <w:lvlJc w:val="left"/>
+      <w:pPr>
+        <w:ind w:left="3600" w:hanging="360"/>
+      </w:pPr>
+    </w:lvl>
+    <w:lvl w:ilvl="5" w:tplc="100A001B" w:tentative="1">
+      <w:start w:val="1"/>
+      <w:numFmt w:val="lowerRoman"/>
+      <w:lvlText w:val="%6."/>
+      <w:lvlJc w:val="right"/>
+      <w:pPr>
+        <w:ind w:left="4320" w:hanging="180"/>
+      </w:pPr>
+    </w:lvl>
+    <w:lvl w:ilvl="6" w:tplc="100A000F" w:tentative="1">
+      <w:start w:val="1"/>
+      <w:numFmt w:val="decimal"/>
+      <w:lvlText w:val="%7."/>
+      <w:lvlJc w:val="left"/>
+      <w:pPr>
+        <w:ind w:left="5040" w:hanging="360"/>
+      </w:pPr>
+    </w:lvl>
+    <w:lvl w:ilvl="7" w:tplc="100A0019" w:tentative="1">
+      <w:start w:val="1"/>
+      <w:numFmt w:val="lowerLetter"/>
+      <w:lvlText w:val="%8."/>
+      <w:lvlJc w:val="left"/>
+      <w:pPr>
+        <w:ind w:left="5760" w:hanging="360"/>
+      </w:pPr>
+    </w:lvl>
+    <w:lvl w:ilvl="8" w:tplc="100A001B" w:tentative="1">
+      <w:start w:val="1"/>
+      <w:numFmt w:val="lowerRoman"/>
+      <w:lvlText w:val="%9."/>
+      <w:lvlJc w:val="right"/>
+      <w:pPr>
+        <w:ind w:left="6480" w:hanging="180"/>
+      </w:pPr>
+    </w:lvl>
+  </w:abstractNum>
+  <w:abstractNum w:abstractNumId="3" w15:restartNumberingAfterBreak="0">
+    <w:nsid w:val="295563A5"/>
+    <w:multiLevelType w:val="hybridMultilevel"/>
+    <w:tmpl w:val="BFA82384"/>
+    <w:lvl w:ilvl="0" w:tplc="100A0001">
+      <w:start w:val="1"/>
+      <w:numFmt w:val="bullet"/>
+      <w:lvlText w:val=""/>
+      <w:lvlJc w:val="left"/>
+      <w:pPr>
+        <w:ind w:left="720" w:hanging="360"/>
+      </w:pPr>
+      <w:rPr>
+        <w:rFonts w:ascii="Symbol" w:hAnsi="Symbol" w:hint="default"/>
+      </w:rPr>
+    </w:lvl>
+    <w:lvl w:ilvl="1" w:tplc="100A0003" w:tentative="1">
+      <w:start w:val="1"/>
+      <w:numFmt w:val="bullet"/>
+      <w:lvlText w:val="o"/>
+      <w:lvlJc w:val="left"/>
+      <w:pPr>
+        <w:ind w:left="1440" w:hanging="360"/>
+      </w:pPr>
+      <w:rPr>
+        <w:rFonts w:ascii="Courier New" w:hAnsi="Courier New" w:cs="Courier New" w:hint="default"/>
+      </w:rPr>
+    </w:lvl>
+    <w:lvl w:ilvl="2" w:tplc="100A0005" w:tentative="1">
+      <w:start w:val="1"/>
+      <w:numFmt w:val="bullet"/>
+      <w:lvlText w:val=""/>
+      <w:lvlJc w:val="left"/>
+      <w:pPr>
+        <w:ind w:left="2160" w:hanging="360"/>
+      </w:pPr>
+      <w:rPr>
+        <w:rFonts w:ascii="Wingdings" w:hAnsi="Wingdings" w:hint="default"/>
+      </w:rPr>
+    </w:lvl>
+    <w:lvl w:ilvl="3" w:tplc="100A0001" w:tentative="1">
+      <w:start w:val="1"/>
+      <w:numFmt w:val="bullet"/>
+      <w:lvlText w:val=""/>
+      <w:lvlJc w:val="left"/>
+      <w:pPr>
+        <w:ind w:left="2880" w:hanging="360"/>
+      </w:pPr>
+      <w:rPr>
+        <w:rFonts w:ascii="Symbol" w:hAnsi="Symbol" w:hint="default"/>
+      </w:rPr>
+    </w:lvl>
+    <w:lvl w:ilvl="4" w:tplc="100A0003" w:tentative="1">
+      <w:start w:val="1"/>
+      <w:numFmt w:val="bullet"/>
+      <w:lvlText w:val="o"/>
+      <w:lvlJc w:val="left"/>
+      <w:pPr>
+        <w:ind w:left="3600" w:hanging="360"/>
+      </w:pPr>
+      <w:rPr>
+        <w:rFonts w:ascii="Courier New" w:hAnsi="Courier New" w:cs="Courier New" w:hint="default"/>
+      </w:rPr>
+    </w:lvl>
+    <w:lvl w:ilvl="5" w:tplc="100A0005" w:tentative="1">
+      <w:start w:val="1"/>
+      <w:numFmt w:val="bullet"/>
+      <w:lvlText w:val=""/>
+      <w:lvlJc w:val="left"/>
+      <w:pPr>
+        <w:ind w:left="4320" w:hanging="360"/>
+      </w:pPr>
+      <w:rPr>
+        <w:rFonts w:ascii="Wingdings" w:hAnsi="Wingdings" w:hint="default"/>
+      </w:rPr>
+    </w:lvl>
+    <w:lvl w:ilvl="6" w:tplc="100A0001" w:tentative="1">
+      <w:start w:val="1"/>
+      <w:numFmt w:val="bullet"/>
+      <w:lvlText w:val=""/>
+      <w:lvlJc w:val="left"/>
+      <w:pPr>
+        <w:ind w:left="5040" w:hanging="360"/>
+      </w:pPr>
+      <w:rPr>
+        <w:rFonts w:ascii="Symbol" w:hAnsi="Symbol" w:hint="default"/>
+      </w:rPr>
+    </w:lvl>
+    <w:lvl w:ilvl="7" w:tplc="100A0003" w:tentative="1">
+      <w:start w:val="1"/>
+      <w:numFmt w:val="bullet"/>
+      <w:lvlText w:val="o"/>
+      <w:lvlJc w:val="left"/>
+      <w:pPr>
+        <w:ind w:left="5760" w:hanging="360"/>
+      </w:pPr>
+      <w:rPr>
+        <w:rFonts w:ascii="Courier New" w:hAnsi="Courier New" w:cs="Courier New" w:hint="default"/>
+      </w:rPr>
+    </w:lvl>
+    <w:lvl w:ilvl="8" w:tplc="100A0005" w:tentative="1">
+      <w:start w:val="1"/>
+      <w:numFmt w:val="bullet"/>
+      <w:lvlText w:val=""/>
+      <w:lvlJc w:val="left"/>
+      <w:pPr>
+        <w:ind w:left="6480" w:hanging="360"/>
+      </w:pPr>
+      <w:rPr>
+        <w:rFonts w:ascii="Wingdings" w:hAnsi="Wingdings" w:hint="default"/>
+      </w:rPr>
+    </w:lvl>
+  </w:abstractNum>
+  <w:abstractNum w:abstractNumId="4" w15:restartNumberingAfterBreak="0">
+    <w:nsid w:val="2961250C"/>
+    <w:multiLevelType w:val="hybridMultilevel"/>
+    <w:tmpl w:val="67966A3E"/>
+    <w:lvl w:ilvl="0" w:tplc="100A000B">
+      <w:start w:val="1"/>
+      <w:numFmt w:val="bullet"/>
+      <w:lvlText w:val=""/>
+      <w:lvlJc w:val="left"/>
+      <w:pPr>
+        <w:ind w:left="720" w:hanging="360"/>
+      </w:pPr>
+      <w:rPr>
+        <w:rFonts w:ascii="Wingdings" w:hAnsi="Wingdings" w:hint="default"/>
+      </w:rPr>
+    </w:lvl>
+    <w:lvl w:ilvl="1" w:tplc="100A0003" w:tentative="1">
+      <w:start w:val="1"/>
+      <w:numFmt w:val="bullet"/>
+      <w:lvlText w:val="o"/>
+      <w:lvlJc w:val="left"/>
+      <w:pPr>
+        <w:ind w:left="1440" w:hanging="360"/>
+      </w:pPr>
+      <w:rPr>
+        <w:rFonts w:ascii="Courier New" w:hAnsi="Courier New" w:cs="Courier New" w:hint="default"/>
+      </w:rPr>
+    </w:lvl>
+    <w:lvl w:ilvl="2" w:tplc="100A0005" w:tentative="1">
+      <w:start w:val="1"/>
+      <w:numFmt w:val="bullet"/>
+      <w:lvlText w:val=""/>
+      <w:lvlJc w:val="left"/>
+      <w:pPr>
+        <w:ind w:left="2160" w:hanging="360"/>
+      </w:pPr>
+      <w:rPr>
+        <w:rFonts w:ascii="Wingdings" w:hAnsi="Wingdings" w:hint="default"/>
+      </w:rPr>
+    </w:lvl>
+    <w:lvl w:ilvl="3" w:tplc="100A0001" w:tentative="1">
+      <w:start w:val="1"/>
+      <w:numFmt w:val="bullet"/>
+      <w:lvlText w:val=""/>
+      <w:lvlJc w:val="left"/>
+      <w:pPr>
+        <w:ind w:left="2880" w:hanging="360"/>
+      </w:pPr>
+      <w:rPr>
+        <w:rFonts w:ascii="Symbol" w:hAnsi="Symbol" w:hint="default"/>
+      </w:rPr>
+    </w:lvl>
+    <w:lvl w:ilvl="4" w:tplc="100A0003" w:tentative="1">
+      <w:start w:val="1"/>
+      <w:numFmt w:val="bullet"/>
+      <w:lvlText w:val="o"/>
+      <w:lvlJc w:val="left"/>
+      <w:pPr>
+        <w:ind w:left="3600" w:hanging="360"/>
+      </w:pPr>
+      <w:rPr>
+        <w:rFonts w:ascii="Courier New" w:hAnsi="Courier New" w:cs="Courier New" w:hint="default"/>
+      </w:rPr>
+    </w:lvl>
+    <w:lvl w:ilvl="5" w:tplc="100A0005" w:tentative="1">
+      <w:start w:val="1"/>
+      <w:numFmt w:val="bullet"/>
+      <w:lvlText w:val=""/>
+      <w:lvlJc w:val="left"/>
+      <w:pPr>
+        <w:ind w:left="4320" w:hanging="360"/>
+      </w:pPr>
+      <w:rPr>
+        <w:rFonts w:ascii="Wingdings" w:hAnsi="Wingdings" w:hint="default"/>
+      </w:rPr>
+    </w:lvl>
+    <w:lvl w:ilvl="6" w:tplc="100A0001" w:tentative="1">
+      <w:start w:val="1"/>
+      <w:numFmt w:val="bullet"/>
+      <w:lvlText w:val=""/>
+      <w:lvlJc w:val="left"/>
+      <w:pPr>
+        <w:ind w:left="5040" w:hanging="360"/>
+      </w:pPr>
+      <w:rPr>
+        <w:rFonts w:ascii="Symbol" w:hAnsi="Symbol" w:hint="default"/>
+      </w:rPr>
+    </w:lvl>
+    <w:lvl w:ilvl="7" w:tplc="100A0003" w:tentative="1">
+      <w:start w:val="1"/>
+      <w:numFmt w:val="bullet"/>
+      <w:lvlText w:val="o"/>
+      <w:lvlJc w:val="left"/>
+      <w:pPr>
+        <w:ind w:left="5760" w:hanging="360"/>
+      </w:pPr>
+      <w:rPr>
+        <w:rFonts w:ascii="Courier New" w:hAnsi="Courier New" w:cs="Courier New" w:hint="default"/>
+      </w:rPr>
+    </w:lvl>
+    <w:lvl w:ilvl="8" w:tplc="100A0005" w:tentative="1">
+      <w:start w:val="1"/>
+      <w:numFmt w:val="bullet"/>
+      <w:lvlText w:val=""/>
+      <w:lvlJc w:val="left"/>
+      <w:pPr>
+        <w:ind w:left="6480" w:hanging="360"/>
+      </w:pPr>
+      <w:rPr>
+        <w:rFonts w:ascii="Wingdings" w:hAnsi="Wingdings" w:hint="default"/>
+      </w:rPr>
+    </w:lvl>
+  </w:abstractNum>
+  <w:abstractNum w:abstractNumId="5" w15:restartNumberingAfterBreak="0">
+    <w:nsid w:val="33557495"/>
+    <w:multiLevelType w:val="hybridMultilevel"/>
+    <w:tmpl w:val="AAA4FA88"/>
+    <w:lvl w:ilvl="0" w:tplc="100A000B">
+      <w:start w:val="1"/>
+      <w:numFmt w:val="bullet"/>
+      <w:lvlText w:val=""/>
+      <w:lvlJc w:val="left"/>
+      <w:pPr>
+        <w:ind w:left="720" w:hanging="360"/>
+      </w:pPr>
+      <w:rPr>
+        <w:rFonts w:ascii="Wingdings" w:hAnsi="Wingdings" w:hint="default"/>
+      </w:rPr>
+    </w:lvl>
+    <w:lvl w:ilvl="1" w:tplc="100A0003" w:tentative="1">
+      <w:start w:val="1"/>
+      <w:numFmt w:val="bullet"/>
+      <w:lvlText w:val="o"/>
+      <w:lvlJc w:val="left"/>
+      <w:pPr>
+        <w:ind w:left="1440" w:hanging="360"/>
+      </w:pPr>
+      <w:rPr>
+        <w:rFonts w:ascii="Courier New" w:hAnsi="Courier New" w:cs="Courier New" w:hint="default"/>
+      </w:rPr>
+    </w:lvl>
+    <w:lvl w:ilvl="2" w:tplc="100A0005" w:tentative="1">
+      <w:start w:val="1"/>
+      <w:numFmt w:val="bullet"/>
+      <w:lvlText w:val=""/>
+      <w:lvlJc w:val="left"/>
+      <w:pPr>
+        <w:ind w:left="2160" w:hanging="360"/>
+      </w:pPr>
+      <w:rPr>
+        <w:rFonts w:ascii="Wingdings" w:hAnsi="Wingdings" w:hint="default"/>
+      </w:rPr>
+    </w:lvl>
+    <w:lvl w:ilvl="3" w:tplc="100A0001" w:tentative="1">
+      <w:start w:val="1"/>
+      <w:numFmt w:val="bullet"/>
+      <w:lvlText w:val=""/>
+      <w:lvlJc w:val="left"/>
+      <w:pPr>
+        <w:ind w:left="2880" w:hanging="360"/>
+      </w:pPr>
+      <w:rPr>
+        <w:rFonts w:ascii="Symbol" w:hAnsi="Symbol" w:hint="default"/>
+      </w:rPr>
+    </w:lvl>
+    <w:lvl w:ilvl="4" w:tplc="100A0003" w:tentative="1">
+      <w:start w:val="1"/>
+      <w:numFmt w:val="bullet"/>
+      <w:lvlText w:val="o"/>
+      <w:lvlJc w:val="left"/>
+      <w:pPr>
+        <w:ind w:left="3600" w:hanging="360"/>
+      </w:pPr>
+      <w:rPr>
+        <w:rFonts w:ascii="Courier New" w:hAnsi="Courier New" w:cs="Courier New" w:hint="default"/>
+      </w:rPr>
+    </w:lvl>
+    <w:lvl w:ilvl="5" w:tplc="100A0005" w:tentative="1">
+      <w:start w:val="1"/>
+      <w:numFmt w:val="bullet"/>
+      <w:lvlText w:val=""/>
+      <w:lvlJc w:val="left"/>
+      <w:pPr>
+        <w:ind w:left="4320" w:hanging="360"/>
+      </w:pPr>
+      <w:rPr>
+        <w:rFonts w:ascii="Wingdings" w:hAnsi="Wingdings" w:hint="default"/>
+      </w:rPr>
+    </w:lvl>
+    <w:lvl w:ilvl="6" w:tplc="100A0001" w:tentative="1">
+      <w:start w:val="1"/>
+      <w:numFmt w:val="bullet"/>
+      <w:lvlText w:val=""/>
+      <w:lvlJc w:val="left"/>
+      <w:pPr>
+        <w:ind w:left="5040" w:hanging="360"/>
+      </w:pPr>
+      <w:rPr>
+        <w:rFonts w:ascii="Symbol" w:hAnsi="Symbol" w:hint="default"/>
+      </w:rPr>
+    </w:lvl>
+    <w:lvl w:ilvl="7" w:tplc="100A0003" w:tentative="1">
+      <w:start w:val="1"/>
+      <w:numFmt w:val="bullet"/>
+      <w:lvlText w:val="o"/>
+      <w:lvlJc w:val="left"/>
+      <w:pPr>
+        <w:ind w:left="5760" w:hanging="360"/>
+      </w:pPr>
+      <w:rPr>
+        <w:rFonts w:ascii="Courier New" w:hAnsi="Courier New" w:cs="Courier New" w:hint="default"/>
+      </w:rPr>
+    </w:lvl>
+    <w:lvl w:ilvl="8" w:tplc="100A0005" w:tentative="1">
+      <w:start w:val="1"/>
+      <w:numFmt w:val="bullet"/>
+      <w:lvlText w:val=""/>
+      <w:lvlJc w:val="left"/>
+      <w:pPr>
+        <w:ind w:left="6480" w:hanging="360"/>
+      </w:pPr>
+      <w:rPr>
+        <w:rFonts w:ascii="Wingdings" w:hAnsi="Wingdings" w:hint="default"/>
+      </w:rPr>
+    </w:lvl>
+  </w:abstractNum>
+  <w:abstractNum w:abstractNumId="6" w15:restartNumberingAfterBreak="0">
     <w:nsid w:val="451C1633"/>
     <w:multiLevelType w:val="hybridMultilevel"/>
     <w:tmpl w:val="B4FEE7A8"/>
@@ -1730,10 +3982,10 @@
       </w:rPr>
     </w:lvl>
   </w:abstractNum>
-  <w:abstractNum w:abstractNumId="2" w15:restartNumberingAfterBreak="0">
+  <w:abstractNum w:abstractNumId="7" w15:restartNumberingAfterBreak="0">
     <w:nsid w:val="75AF7FF5"/>
     <w:multiLevelType w:val="hybridMultilevel"/>
-    <w:tmpl w:val="40C8A590"/>
+    <w:tmpl w:val="5A642626"/>
     <w:lvl w:ilvl="0" w:tplc="100A000B">
       <w:start w:val="1"/>
       <w:numFmt w:val="bullet"/>
@@ -1844,13 +4096,28 @@
     </w:lvl>
   </w:abstractNum>
   <w:num w:numId="1" w16cid:durableId="1452362971">
-    <w:abstractNumId w:val="1"/>
+    <w:abstractNumId w:val="6"/>
   </w:num>
   <w:num w:numId="2" w16cid:durableId="1828092071">
-    <w:abstractNumId w:val="2"/>
+    <w:abstractNumId w:val="7"/>
   </w:num>
   <w:num w:numId="3" w16cid:durableId="1035892083">
     <w:abstractNumId w:val="0"/>
+  </w:num>
+  <w:num w:numId="4" w16cid:durableId="1321704">
+    <w:abstractNumId w:val="1"/>
+  </w:num>
+  <w:num w:numId="5" w16cid:durableId="172382067">
+    <w:abstractNumId w:val="3"/>
+  </w:num>
+  <w:num w:numId="6" w16cid:durableId="310721620">
+    <w:abstractNumId w:val="2"/>
+  </w:num>
+  <w:num w:numId="7" w16cid:durableId="205262245">
+    <w:abstractNumId w:val="5"/>
+  </w:num>
+  <w:num w:numId="8" w16cid:durableId="1447507154">
+    <w:abstractNumId w:val="4"/>
   </w:num>
 </w:numbering>
 </file>
@@ -2459,7 +4726,6 @@
   <w:style w:type="character" w:default="1" w:styleId="Fuentedeprrafopredeter">
     <w:name w:val="Default Paragraph Font"/>
     <w:uiPriority w:val="1"/>
-    <w:semiHidden/>
     <w:unhideWhenUsed/>
   </w:style>
   <w:style w:type="table" w:default="1" w:styleId="Tablanormal">
@@ -2807,6 +5073,18 @@
       <w:u w:val="single"/>
     </w:rPr>
   </w:style>
+  <w:style w:type="character" w:styleId="Mencinsinresolver">
+    <w:name w:val="Unresolved Mention"/>
+    <w:basedOn w:val="Fuentedeprrafopredeter"/>
+    <w:uiPriority w:val="99"/>
+    <w:semiHidden/>
+    <w:unhideWhenUsed/>
+    <w:rsid w:val="00180B4F"/>
+    <w:rPr>
+      <w:color w:val="605E5C"/>
+      <w:shd w:val="clear" w:color="auto" w:fill="E1DFDD"/>
+    </w:rPr>
+  </w:style>
 </w:styles>
 </file>
 
@@ -3103,4 +5381,16 @@
     </a:ext>
   </a:extLst>
 </a:theme>
+</file>
+
+<file path=customXml/item1.xml><?xml version="1.0" encoding="utf-8"?>
+<b:Sources xmlns:b="http://schemas.openxmlformats.org/officeDocument/2006/bibliography" xmlns="http://schemas.openxmlformats.org/officeDocument/2006/bibliography" SelectedStyle="\APASixthEditionOfficeOnline.xsl" StyleName="APA" Version="6"/>
+</file>
+
+<file path=customXml/itemProps1.xml><?xml version="1.0" encoding="utf-8"?>
+<ds:datastoreItem xmlns:ds="http://schemas.openxmlformats.org/officeDocument/2006/customXml" ds:itemID="{71BC699F-D6F7-4B6F-85E8-1B2D4A70DDBA}">
+  <ds:schemaRefs>
+    <ds:schemaRef ds:uri="http://schemas.openxmlformats.org/officeDocument/2006/bibliography"/>
+  </ds:schemaRefs>
+</ds:datastoreItem>
 </file>
</xml_diff>